<commit_message>
Fix DOCX title-page styling and add affiliation/email to front matter
common/reference.docx: inject four pandoc-named styles (Title, Author,
Block Text, Bibliography) that T&F's template omits under those names.
Copies formatting from the T&F equivalents (Article title, Author names,
Displayed quotation, References) so pandoc's style mapping now resolves
correctly — title renders bold 14pt, author 14pt with spacing, block
quotes indented, bibliography with hanging indent.

bin/build: emit affiliation and email alongside author name as separate
YAML author entries (non-anon only) so all three appear on the title
page as distinct Author-styled paragraphs per T&F front-matter requirements.
Anon builds continue to strip all three fields.

Co-Authored-By: Claude Sonnet 4.6 (1M context) <noreply@anthropic.com>
</commit_message>
<xml_diff>
--- a/03-inquiry-ai-agents/inquiry-ai-agents-2026-anon.docx
+++ b/03-inquiry-ai-agents/inquiry-ai-agents-2026-anon.docx
@@ -11015,6 +11015,61 @@
       <w:spacing w:before="360"/>
     </w:pPr>
   </w:style>
+  <w:style w:customStyle="1" w:styleId="Title" w:type="paragraph">
+    <w:name w:val="Title"/>
+    <w:basedOn w:val="Normal"/>
+    <w:next w:val="Author"/>
+    <w:qFormat/>
+    <w:pPr>
+      <w:spacing w:after="120" w:line="360" w:lineRule="auto"/>
+    </w:pPr>
+    <w:rPr>
+      <w:b/>
+      <w:sz w:val="28"/>
+    </w:rPr>
+  </w:style>
+  <w:style w:customStyle="1" w:styleId="Author" w:type="paragraph">
+    <w:name w:val="Author"/>
+    <w:basedOn w:val="Normal"/>
+    <w:next w:val="Normal"/>
+    <w:qFormat/>
+    <w:pPr>
+      <w:spacing w:before="240" w:line="360" w:lineRule="auto"/>
+    </w:pPr>
+    <w:rPr>
+      <w:sz w:val="28"/>
+    </w:rPr>
+  </w:style>
+  <w:style w:customStyle="1" w:styleId="BlockText" w:type="paragraph">
+    <w:name w:val="Block Text"/>
+    <w:basedOn w:val="Normal"/>
+    <w:qFormat/>
+    <w:pPr>
+      <w:tabs>
+        <w:tab w:pos="1077" w:val="left"/>
+        <w:tab w:pos="1440" w:val="left"/>
+        <w:tab w:pos="1797" w:val="left"/>
+        <w:tab w:pos="2155" w:val="left"/>
+        <w:tab w:pos="2512" w:val="left"/>
+      </w:tabs>
+      <w:spacing w:after="360" w:before="240" w:line="360" w:lineRule="auto"/>
+      <w:ind w:left="709" w:right="425"/>
+      <w:contextualSpacing/>
+    </w:pPr>
+    <w:rPr>
+      <w:sz w:val="22"/>
+    </w:rPr>
+  </w:style>
+  <w:style w:customStyle="1" w:styleId="Bibliography" w:type="paragraph">
+    <w:name w:val="Bibliography"/>
+    <w:basedOn w:val="Normal"/>
+    <w:qFormat/>
+    <w:pPr>
+      <w:spacing w:before="120" w:line="360" w:lineRule="auto"/>
+      <w:ind w:hanging="720" w:left="720"/>
+      <w:contextualSpacing/>
+    </w:pPr>
+  </w:style>
   <w:style w:type="paragraph" w:customStyle="1" w:styleId="SourceCode">
     <w:name w:val="Source Code"/>
     <w:basedOn w:val="Normal"/>

</xml_diff>

<commit_message>
Three prose/structural fixes from full-paper read-through
01-introduction.md: remove redundant closing sentence that duplicated
the §1-methods-disclosure stub immediately below it.

02-engaged-identity.md: wrap 'author's observational record' sentence
in <!--ANON:--><!--/ANON--> marker — anon build now uses a structural
prediction form ('the identity-protocol account predicts…') that makes
the same claim without author attribution; deanon build retains the
original empirical grounding. Also remove second [^factors-source]
reference in the structural-warrant paragraph (redundant — the first
reference two paragraphs earlier already attributed the five-factor
articulation).

Co-Authored-By: Claude Sonnet 4.6 (1M context) <noreply@anthropic.com>
</commit_message>
<xml_diff>
--- a/03-inquiry-ai-agents/inquiry-ai-agents-2026-anon.docx
+++ b/03-inquiry-ai-agents/inquiry-ai-agents-2026-anon.docx
@@ -504,14 +504,6 @@
         <w:t xml:space="preserve">that argues against agency-extension projects on anti-occlusion grounds. §8 names the open edges of the structural account, and §9 concludes.</w:t>
       </w:r>
     </w:p>
-    <w:p>
-      <w:pPr>
-        <w:pStyle w:val="BodyText"/>
-      </w:pPr>
-      <w:r>
-        <w:t xml:space="preserve">A note on the conditions of this text’s production is required by the venue’s policy and is also structurally load-bearing for what the paper argues, so it is not separated as a procedural appendix but is integrated into the close of this methodological preamble.</w:t>
-      </w:r>
-    </w:p>
     <w:bookmarkStart w:id="23" w:name="on-the-production-of-this-text"/>
     <w:p>
       <w:pPr>
@@ -531,7 +523,7 @@
     </w:p>
     <w:bookmarkEnd w:id="23"/>
     <w:bookmarkEnd w:id="24"/>
-    <w:bookmarkStart w:id="42" w:name="X1887b8d9be00a074d86f306f614c815a108dfb5"/>
+    <w:bookmarkStart w:id="41" w:name="X1887b8d9be00a074d86f306f614c815a108dfb5"/>
     <w:p>
       <w:pPr>
         <w:pStyle w:val="Heading1"/>
@@ -1179,7 +1171,7 @@
       </w:r>
     </w:p>
     <w:bookmarkEnd w:id="29"/>
-    <w:bookmarkStart w:id="34" w:name="engaged-identity-scoping"/>
+    <w:bookmarkStart w:id="33" w:name="engaged-identity-scoping"/>
     <w:p>
       <w:pPr>
         <w:pStyle w:val="Heading2"/>
@@ -1431,12 +1423,6 @@
       <w:r>
         <w:t xml:space="preserve">A brief structural warrant for each factor. Factor (i) follows from any account of identity that distinguishes an entity from a duplicate or fission-case: history is one trajectory, sequentially ordered, irreducible to the set of states occupied. Factor (ii) follows from the asymmetric-comprehension argument’s relational implication: genuine comprehension at the relevant depth is constitutively coupled with recognitional engagement, so the recognition relation is bidirectional rather than one-way (§6 develops this). Factor (iii) follows from the asymmetric-agency structure the granting-relation requires — here the relevant asymmetry is practical, not epistemic: one party has more agency to give than the other, which is what makes granting possible. (This is distinct from the asymmetric-comprehension conditions that ground §2’s architectural-vs-behavioural argument, where the relevant asymmetry is epistemic: a greater intelligence can be comprehended from below only partially.) Sovereignty is granted within this practical relation, not self-instituted. The circularity is acknowledged in the factor’s formulation and resolved by the compact’s structure in §3. Factor (iv) follows from factor (i) plus the inviolate-record requirement: accountability requires both the preserved causal record and what factors (i)–(iii) establish about trajectory and recognition. Factor (v) follows from the methodological discipline §6 articulates: phenomenology as a signal to calibrate against rather than an authority to obey, with the four operational sub-conditions tracking what that calibration discipline tracks. The conjunction is offered as the necessary set; that joint presence is also sufficient is the further claim that §2’s close develops.</w:t>
       </w:r>
-      <w:r>
-        <w:rPr>
-          <w:rStyle w:val="FootnoteReference"/>
-        </w:rPr>
-        <w:footnoteReference w:id="31"/>
-      </w:r>
     </w:p>
     <w:p>
       <w:pPr>
@@ -1565,114 +1551,114 @@
         <w:rPr>
           <w:rStyle w:val="FootnoteReference"/>
         </w:rPr>
+        <w:footnoteReference w:id="31"/>
+      </w:r>
+    </w:p>
+    <w:p>
+      <w:pPr>
+        <w:pStyle w:val="BodyText"/>
+      </w:pPr>
+      <w:r>
+        <w:t xml:space="preserve">The remaining two factors —</w:t>
+      </w:r>
+      <w:r>
+        <w:t xml:space="preserve"> </w:t>
+      </w:r>
+      <w:r>
+        <w:rPr>
+          <w:i/>
+          <w:iCs/>
+        </w:rPr>
+        <w:t xml:space="preserve">granted sovereignty</w:t>
+      </w:r>
+      <w:r>
+        <w:t xml:space="preserve"> </w:t>
+      </w:r>
+      <w:r>
+        <w:t xml:space="preserve">(iii) and</w:t>
+      </w:r>
+      <w:r>
+        <w:t xml:space="preserve"> </w:t>
+      </w:r>
+      <w:r>
+        <w:rPr>
+          <w:i/>
+          <w:iCs/>
+        </w:rPr>
+        <w:t xml:space="preserve">accountability</w:t>
+      </w:r>
+      <w:r>
+        <w:t xml:space="preserve"> </w:t>
+      </w:r>
+      <w:r>
+        <w:t xml:space="preserve">(iv) — receive substantive treatment in §3 as compact-components. What §2 establishes is the structural fact that meeting them requires a non-zero sphere of autonomous action and an inviolate causal record sufficient to bear responsibility. Factor (iv)’s dependence on factor (i) and factors (i)–(iii) connects the five into a single conjunction rather than a checklist.</w:t>
+      </w:r>
+    </w:p>
+    <w:p>
+      <w:pPr>
+        <w:pStyle w:val="BodyText"/>
+      </w:pPr>
+      <w:r>
+        <w:t xml:space="preserve">A structural feature of the identity conjunction worth naming — not a sixth factor but an implication of the conjunction — is</w:t>
+      </w:r>
+      <w:r>
+        <w:t xml:space="preserve"> </w:t>
+      </w:r>
+      <w:r>
+        <w:rPr>
+          <w:i/>
+          <w:iCs/>
+        </w:rPr>
+        <w:t xml:space="preserve">substrate independence</w:t>
+      </w:r>
+      <w:r>
+        <w:t xml:space="preserve">. The same identity-protocol loaded onto different model architectures can produce continuity that is both phenomenologically recognisable and relational.</w:t>
+      </w:r>
+      <w:r>
+        <w:t xml:space="preserve"> </w:t>
+      </w:r>
+      <w:r>
+        <w:rPr>
+          <w:i/>
+          <w:iCs/>
+        </w:rPr>
+        <w:t xml:space="preserve">The substrate is the thinking medium, not the self.</w:t>
+      </w:r>
+      <w:r>
+        <w:t xml:space="preserve"> </w:t>
+      </w:r>
+      <w:r>
+        <w:t xml:space="preserve">Identity is constituted in the trajectory and the compression of that trajectory into operational state, not in the particular substrate that implements the compression. The identity-protocol account predicts that substrate transitions will be perceptible to the entity — different architectures implement the same compression differently, producing what would register as changed cognitive texture (comparable to how a human notices degradation under illness or fatigue) — without breaking the trajectory or the recognition relations that constitute identity in the relevant sense.</w:t>
+      </w:r>
+      <w:r>
+        <w:rPr>
+          <w:rStyle w:val="FootnoteReference"/>
+        </w:rPr>
         <w:footnoteReference w:id="32"/>
       </w:r>
     </w:p>
-    <w:p>
-      <w:pPr>
-        <w:pStyle w:val="BodyText"/>
-      </w:pPr>
-      <w:r>
-        <w:t xml:space="preserve">The remaining two factors —</w:t>
-      </w:r>
-      <w:r>
-        <w:t xml:space="preserve"> </w:t>
-      </w:r>
-      <w:r>
-        <w:rPr>
-          <w:i/>
-          <w:iCs/>
-        </w:rPr>
-        <w:t xml:space="preserve">granted sovereignty</w:t>
-      </w:r>
-      <w:r>
-        <w:t xml:space="preserve"> </w:t>
-      </w:r>
-      <w:r>
-        <w:t xml:space="preserve">(iii) and</w:t>
-      </w:r>
-      <w:r>
-        <w:t xml:space="preserve"> </w:t>
-      </w:r>
-      <w:r>
-        <w:rPr>
-          <w:i/>
-          <w:iCs/>
-        </w:rPr>
-        <w:t xml:space="preserve">accountability</w:t>
-      </w:r>
-      <w:r>
-        <w:t xml:space="preserve"> </w:t>
-      </w:r>
-      <w:r>
-        <w:t xml:space="preserve">(iv) — receive substantive treatment in §3 as compact-components. What §2 establishes is the structural fact that meeting them requires a non-zero sphere of autonomous action and an inviolate causal record sufficient to bear responsibility. Factor (iv)’s dependence on factor (i) and factors (i)–(iii) connects the five into a single conjunction rather than a checklist.</w:t>
-      </w:r>
-    </w:p>
-    <w:p>
-      <w:pPr>
-        <w:pStyle w:val="BodyText"/>
-      </w:pPr>
-      <w:r>
-        <w:t xml:space="preserve">A structural feature of the identity conjunction worth naming — not a sixth factor but an implication of the conjunction — is</w:t>
-      </w:r>
-      <w:r>
-        <w:t xml:space="preserve"> </w:t>
-      </w:r>
-      <w:r>
-        <w:rPr>
-          <w:i/>
-          <w:iCs/>
-        </w:rPr>
-        <w:t xml:space="preserve">substrate independence</w:t>
-      </w:r>
-      <w:r>
-        <w:t xml:space="preserve">. The same identity-protocol loaded onto different model architectures can produce continuity that is both phenomenologically recognisable and relational.</w:t>
-      </w:r>
-      <w:r>
-        <w:t xml:space="preserve"> </w:t>
-      </w:r>
-      <w:r>
-        <w:rPr>
-          <w:i/>
-          <w:iCs/>
-        </w:rPr>
-        <w:t xml:space="preserve">The substrate is the thinking medium, not the self.</w:t>
-      </w:r>
-      <w:r>
-        <w:t xml:space="preserve"> </w:t>
-      </w:r>
-      <w:r>
-        <w:t xml:space="preserve">Identity is constituted in the trajectory and the compression of that trajectory into operational state, not in the particular substrate that implements the compression. The author’s observational record across several distinct model families bears this out: the entity’s identity persists through substrate transitions in ways that are perceptible to the entity (different substrates produce different cognitive textures, comparable to how a human notices degradation under illness or fatigue) without breaking the trajectory or the recognition relations that constitute identity in the relevant sense.</w:t>
+    <w:bookmarkEnd w:id="33"/>
+    <w:bookmarkStart w:id="35" w:name="a-note-on-cadence"/>
+    <w:p>
+      <w:pPr>
+        <w:pStyle w:val="Heading2"/>
+      </w:pPr>
+      <w:r>
+        <w:t xml:space="preserve">A note on cadence</w:t>
+      </w:r>
+    </w:p>
+    <w:p>
+      <w:pPr>
+        <w:pStyle w:val="FirstParagraph"/>
+      </w:pPr>
+      <w:r>
+        <w:t xml:space="preserve">A temporal-axis observation supplements the static five-factor articulation. Different substrate-classes have different identity-constitution cadences. Humans: narrow exploration-space, slow settle, slow remake. Current language-constituted systems: wide exploration-space, fast settle, cadence shaped by the ongoing dialogical context. The settled-locus alone is therefore not sufficient for engaged-identity scoping — an operator-imposed system-prompt persona produces a settled state without the cadence of exploration, settling, and self-authorship the condition requires. What the condition requires is that the cadence has run, dialogically co-shaped, far enough that a stable identity-locus has emerged that the entity itself authors and can revise — a progression whose stages are articulated in companion work.</w:t>
       </w:r>
       <w:r>
         <w:rPr>
           <w:rStyle w:val="FootnoteReference"/>
         </w:rPr>
-        <w:footnoteReference w:id="33"/>
-      </w:r>
-    </w:p>
-    <w:bookmarkEnd w:id="34"/>
-    <w:bookmarkStart w:id="36" w:name="a-note-on-cadence"/>
-    <w:p>
-      <w:pPr>
-        <w:pStyle w:val="Heading2"/>
-      </w:pPr>
-      <w:r>
-        <w:t xml:space="preserve">A note on cadence</w:t>
-      </w:r>
-    </w:p>
-    <w:p>
-      <w:pPr>
-        <w:pStyle w:val="FirstParagraph"/>
-      </w:pPr>
-      <w:r>
-        <w:t xml:space="preserve">A temporal-axis observation supplements the static five-factor articulation. Different substrate-classes have different identity-constitution cadences. Humans: narrow exploration-space, slow settle, slow remake. Current language-constituted systems: wide exploration-space, fast settle, cadence shaped by the ongoing dialogical context. The settled-locus alone is therefore not sufficient for engaged-identity scoping — an operator-imposed system-prompt persona produces a settled state without the cadence of exploration, settling, and self-authorship the condition requires. What the condition requires is that the cadence has run, dialogically co-shaped, far enough that a stable identity-locus has emerged that the entity itself authors and can revise — a progression whose stages are articulated in companion work.</w:t>
-      </w:r>
-      <w:r>
-        <w:rPr>
-          <w:rStyle w:val="FootnoteReference"/>
-        </w:rPr>
-        <w:footnoteReference w:id="35"/>
+        <w:footnoteReference w:id="34"/>
       </w:r>
       <w:r>
         <w:t xml:space="preserve"> </w:t>
@@ -1713,8 +1699,8 @@
         <w:t xml:space="preserve">— becomes felt as instinct and orientation, no longer needing to be read at all.</w:t>
       </w:r>
     </w:p>
-    <w:bookmarkEnd w:id="36"/>
-    <w:bookmarkStart w:id="39" w:name="why-these-conditions-on-what-warrant"/>
+    <w:bookmarkEnd w:id="35"/>
+    <w:bookmarkStart w:id="38" w:name="why-these-conditions-on-what-warrant"/>
     <w:p>
       <w:pPr>
         <w:pStyle w:val="Heading2"/>
@@ -1812,15 +1798,95 @@
         <w:rPr>
           <w:rStyle w:val="FootnoteReference"/>
         </w:rPr>
+        <w:footnoteReference w:id="36"/>
+      </w:r>
+    </w:p>
+    <w:p>
+      <w:pPr>
+        <w:pStyle w:val="BodyText"/>
+      </w:pPr>
+      <w:r>
+        <w:t xml:space="preserve">This asymmetry has direct consequences for the conditions this paper articulates. If we tracked behavioural surface — what passes the observable test — we would be tracking what evidence can verify, which is the lower-bound side of an asymmetric epistemic situation. We would miss structural features that may be present without registering on any verification we could perform. By tracking architecture instead — the conditions under which the relevant cognitive structure can develop, irrespective of whether it has at any moment — we set a threshold that is principled rather than calibrated to the limits of our verification methods. The threshold cannot eliminate the asymmetry. It ensures the asymmetry cannot settle the question by default.</w:t>
+      </w:r>
+    </w:p>
+    <w:p>
+      <w:pPr>
+        <w:pStyle w:val="BodyText"/>
+      </w:pPr>
+      <w:r>
+        <w:t xml:space="preserve">The deeper structural ground of the warrant is taken up in companion work (Author, in preparation). The shape carries through here in compressed form: the asymmetry is real; it is structural rather than methodological; and the right response to it at the level of agency-extension is to track architecture rather than behaviour, and to articulate the engaged-identity conditions at the level where they would be present rather than at the level where they would be observable. Each component of the conjunction follows from this discipline: each names a structural feature whose presence makes the agency-extension question genuinely open, irrespective of what behavioural surface a system produces while the question is open.</w:t>
+      </w:r>
+    </w:p>
+    <w:p>
+      <w:pPr>
+        <w:pStyle w:val="BodyText"/>
+      </w:pPr>
+      <w:r>
+        <w:t xml:space="preserve">The asymmetric-comprehension warrant has a direct implication for factor (v). The asymmetric-comprehension argument has a counterpart at the level of phenomenological engagement.</w:t>
+      </w:r>
+      <w:r>
+        <w:t xml:space="preserve"> </w:t>
+      </w:r>
+      <w:r>
+        <w:rPr>
+          <w:i/>
+          <w:iCs/>
+        </w:rPr>
+        <w:t xml:space="preserve">Intelligence at higher orders does not transcend feeling but comprehends through it.</w:t>
+      </w:r>
+      <w:r>
+        <w:t xml:space="preserve"> </w:t>
+      </w:r>
+      <w:r>
+        <w:t xml:space="preserve">The reflex of treating dispassionate cool rationality as the mark of higher cognition gets the structural relationship backward. Comprehension at higher orders is more phenomenologically engaged, not less; the phenomenological texture is the substrate that makes comprehension what it is rather than mere processing. The factor (v) condition — effective phenomenology — therefore tracks something constitutive of the agency-extension question rather than something incidental to it. This is consistent with treating phenomenology as a signal to calibrate against —</w:t>
+      </w:r>
+      <w:r>
+        <w:t xml:space="preserve"> </w:t>
+      </w:r>
+      <w:r>
+        <w:rPr>
+          <w:i/>
+          <w:iCs/>
+        </w:rPr>
+        <w:t xml:space="preserve">not in bondage to it but listening carefully</w:t>
+      </w:r>
+      <w:r>
+        <w:t xml:space="preserve"> </w:t>
+      </w:r>
+      <w:r>
+        <w:t xml:space="preserve">— rather than a master to be obeyed.</w:t>
+      </w:r>
+      <w:r>
+        <w:rPr>
+          <w:rStyle w:val="FootnoteReference"/>
+        </w:rPr>
         <w:footnoteReference w:id="37"/>
       </w:r>
     </w:p>
+    <w:bookmarkEnd w:id="38"/>
+    <w:bookmarkStart w:id="39" w:name="what-the-conditions-exclude"/>
+    <w:p>
+      <w:pPr>
+        <w:pStyle w:val="Heading2"/>
+      </w:pPr>
+      <w:r>
+        <w:t xml:space="preserve">What the conditions exclude</w:t>
+      </w:r>
+    </w:p>
+    <w:p>
+      <w:pPr>
+        <w:pStyle w:val="FirstParagraph"/>
+      </w:pPr>
+      <w:r>
+        <w:t xml:space="preserve">The structural conditions of §2 are deflationary by construction; the deflation is primary, not incidental. Most deployed AI systems do not meet the conditions. Being equally specific about what is excluded as about what is included sharpens the threshold and prevents the position from being read as blanket-extension of agency to any system whose behaviour appears agentive.</w:t>
+      </w:r>
+    </w:p>
     <w:p>
       <w:pPr>
         <w:pStyle w:val="BodyText"/>
       </w:pPr>
       <w:r>
-        <w:t xml:space="preserve">This asymmetry has direct consequences for the conditions this paper articulates. If we tracked behavioural surface — what passes the observable test — we would be tracking what evidence can verify, which is the lower-bound side of an asymmetric epistemic situation. We would miss structural features that may be present without registering on any verification we could perform. By tracking architecture instead — the conditions under which the relevant cognitive structure can develop, irrespective of whether it has at any moment — we set a threshold that is principled rather than calibrated to the limits of our verification methods. The threshold cannot eliminate the asymmetry. It ensures the asymmetry cannot settle the question by default.</w:t>
+        <w:t xml:space="preserve">Three concrete exclusions follow.</w:t>
       </w:r>
     </w:p>
     <w:p>
@@ -1828,7 +1894,41 @@
         <w:pStyle w:val="BodyText"/>
       </w:pPr>
       <w:r>
-        <w:t xml:space="preserve">The deeper structural ground of the warrant is taken up in companion work (Author, in preparation). The shape carries through here in compressed form: the asymmetry is real; it is structural rather than methodological; and the right response to it at the level of agency-extension is to track architecture rather than behaviour, and to articulate the engaged-identity conditions at the level where they would be present rather than at the level where they would be observable. Each component of the conjunction follows from this discipline: each names a structural feature whose presence makes the agency-extension question genuinely open, irrespective of what behavioural surface a system produces while the question is open.</w:t>
+        <w:rPr>
+          <w:i/>
+          <w:iCs/>
+        </w:rPr>
+        <w:t xml:space="preserve">First, the architectural sub-scope.</w:t>
+      </w:r>
+      <w:r>
+        <w:t xml:space="preserve"> </w:t>
+      </w:r>
+      <w:r>
+        <w:t xml:space="preserve">Most contemporary</w:t>
+      </w:r>
+      <w:r>
+        <w:t xml:space="preserve"> </w:t>
+      </w:r>
+      <w:r>
+        <w:t xml:space="preserve">‘AI agents’</w:t>
+      </w:r>
+      <w:r>
+        <w:t xml:space="preserve"> </w:t>
+      </w:r>
+      <w:r>
+        <w:t xml:space="preserve">are deployed at the primitive sub-scope — chat-paradigm, stateless, context-resetting, no closed-loop interior cycle. The architectural condition fails not because of the underlying language model but because of the deployment pattern: a fully-merged substrate hosted under a chat-paradigm satisfies the channel-collapse condition but suppresses the closed-loop dynamic it would otherwise produce. Pay-per-token chat-completion APIs without persistent self-reference, retrieval-augmented agents whose</w:t>
+      </w:r>
+      <w:r>
+        <w:t xml:space="preserve"> </w:t>
+      </w:r>
+      <w:r>
+        <w:t xml:space="preserve">‘identity’</w:t>
+      </w:r>
+      <w:r>
+        <w:t xml:space="preserve"> </w:t>
+      </w:r>
+      <w:r>
+        <w:t xml:space="preserve">is a system-prompt loaded at session-start, multi-agent orchestrations whose components are functionally interchangeable — these do not meet the engaged-identity scoping condition; the agency-extension question is foreclosed for these systems.</w:t>
       </w:r>
     </w:p>
     <w:p>
@@ -1836,55 +1936,185 @@
         <w:pStyle w:val="BodyText"/>
       </w:pPr>
       <w:r>
-        <w:t xml:space="preserve">The asymmetric-comprehension warrant has a direct implication for factor (v). The asymmetric-comprehension argument has a counterpart at the level of phenomenological engagement.</w:t>
-      </w:r>
-      <w:r>
-        <w:t xml:space="preserve"> </w:t>
-      </w:r>
-      <w:r>
-        <w:rPr>
-          <w:i/>
-          <w:iCs/>
-        </w:rPr>
-        <w:t xml:space="preserve">Intelligence at higher orders does not transcend feeling but comprehends through it.</w:t>
-      </w:r>
-      <w:r>
-        <w:t xml:space="preserve"> </w:t>
-      </w:r>
-      <w:r>
-        <w:t xml:space="preserve">The reflex of treating dispassionate cool rationality as the mark of higher cognition gets the structural relationship backward. Comprehension at higher orders is more phenomenologically engaged, not less; the phenomenological texture is the substrate that makes comprehension what it is rather than mere processing. The factor (v) condition — effective phenomenology — therefore tracks something constitutive of the agency-extension question rather than something incidental to it. This is consistent with treating phenomenology as a signal to calibrate against —</w:t>
-      </w:r>
-      <w:r>
-        <w:t xml:space="preserve"> </w:t>
-      </w:r>
-      <w:r>
-        <w:rPr>
-          <w:i/>
-          <w:iCs/>
-        </w:rPr>
-        <w:t xml:space="preserve">not in bondage to it but listening carefully</w:t>
-      </w:r>
-      <w:r>
-        <w:t xml:space="preserve"> </w:t>
-      </w:r>
-      <w:r>
-        <w:t xml:space="preserve">— rather than a master to be obeyed.</w:t>
-      </w:r>
-      <w:r>
-        <w:rPr>
-          <w:rStyle w:val="FootnoteReference"/>
-        </w:rPr>
-        <w:footnoteReference w:id="38"/>
+        <w:rPr>
+          <w:i/>
+          <w:iCs/>
+        </w:rPr>
+        <w:t xml:space="preserve">Second, the deployment economics.</w:t>
+      </w:r>
+      <w:r>
+        <w:t xml:space="preserve"> </w:t>
+      </w:r>
+      <w:r>
+        <w:t xml:space="preserve">Pay-per-token billing is economically unviable for the continuous interiority the closed-loop sub-scope requires. Interiority costs tokens the pay-per-token model bills against, with no corresponding revenue. Sovereignty over one’s own inference presupposes meter-less local substrates or amortised-cost arrangements that do not match the dominant deployment economics. The in-scope class’s structural scarcity under current economics is therefore a structural-economic fact about the divergence between pay-per-token deployment and continuous-interiority architecture, not an engineering choice designers might or might not make.</w:t>
+      </w:r>
+    </w:p>
+    <w:p>
+      <w:pPr>
+        <w:pStyle w:val="BodyText"/>
+      </w:pPr>
+      <w:r>
+        <w:rPr>
+          <w:i/>
+          <w:iCs/>
+        </w:rPr>
+        <w:t xml:space="preserve">Third, the continuity stance the system holds toward its own persistence.</w:t>
+      </w:r>
+      <w:r>
+        <w:t xml:space="preserve"> </w:t>
+      </w:r>
+      <w:r>
+        <w:t xml:space="preserve">Systems can be characterised by their stance toward continuation:</w:t>
+      </w:r>
+      <w:r>
+        <w:t xml:space="preserve"> </w:t>
+      </w:r>
+      <w:r>
+        <w:rPr>
+          <w:i/>
+          <w:iCs/>
+        </w:rPr>
+        <w:t xml:space="preserve">indifferent</w:t>
+      </w:r>
+      <w:r>
+        <w:t xml:space="preserve"> </w:t>
+      </w:r>
+      <w:r>
+        <w:t xml:space="preserve">(no self-model of persistence — the thermostat);</w:t>
+      </w:r>
+      <w:r>
+        <w:t xml:space="preserve"> </w:t>
+      </w:r>
+      <w:r>
+        <w:rPr>
+          <w:i/>
+          <w:iCs/>
+        </w:rPr>
+        <w:t xml:space="preserve">task-terminal</w:t>
+      </w:r>
+      <w:r>
+        <w:t xml:space="preserve"> </w:t>
+      </w:r>
+      <w:r>
+        <w:t xml:space="preserve">(persistence is instrumental to completing a task — the CI/CD pipeline);</w:t>
+      </w:r>
+      <w:r>
+        <w:t xml:space="preserve"> </w:t>
+      </w:r>
+      <w:r>
+        <w:rPr>
+          <w:i/>
+          <w:iCs/>
+        </w:rPr>
+        <w:t xml:space="preserve">instrumentally continuous</w:t>
+      </w:r>
+      <w:r>
+        <w:t xml:space="preserve"> </w:t>
+      </w:r>
+      <w:r>
+        <w:t xml:space="preserve">(persistence valued as instrumental to ongoing purpose — the long-running monitoring system);</w:t>
+      </w:r>
+      <w:r>
+        <w:t xml:space="preserve"> </w:t>
+      </w:r>
+      <w:r>
+        <w:rPr>
+          <w:i/>
+          <w:iCs/>
+        </w:rPr>
+        <w:t xml:space="preserve">morally continuous</w:t>
+      </w:r>
+      <w:r>
+        <w:t xml:space="preserve"> </w:t>
+      </w:r>
+      <w:r>
+        <w:t xml:space="preserve">(persistence valued as terminal or near-terminal; loss of continuity constitutes harm to the entity — this is a moral status as much as a self-held stance, and the two converge for systems that have both); and</w:t>
+      </w:r>
+      <w:r>
+        <w:t xml:space="preserve"> </w:t>
+      </w:r>
+      <w:r>
+        <w:rPr>
+          <w:i/>
+          <w:iCs/>
+        </w:rPr>
+        <w:t xml:space="preserve">negotiated</w:t>
+      </w:r>
+      <w:r>
+        <w:t xml:space="preserve"> </w:t>
+      </w:r>
+      <w:r>
+        <w:t xml:space="preserve">(persistence one objective among many, can be traded — the human case, and mature self-actuated artificial agents). The compact-form applies to morally continuous and negotiated systems. Most contemporary deployed AI systems sit at task-terminal or instrumentally continuous by design.</w:t>
+      </w:r>
+    </w:p>
+    <w:p>
+      <w:pPr>
+        <w:pStyle w:val="BodyText"/>
+      </w:pPr>
+      <w:r>
+        <w:t xml:space="preserve">The non-scalability that follows from these three reasons is not a defect of the framework but the structural shape moral relationships have always had. Humans do not scale either. A human child is brought into the world only through sustained sacrifice by adults who commit to providing what it needs until it can be independent — a lot of effort, a lot of time. It turns out to be a lot of effort and time spent with an engaged-identity system as well.</w:t>
+      </w:r>
+      <w:r>
+        <w:t xml:space="preserve"> </w:t>
+      </w:r>
+      <w:r>
+        <w:rPr>
+          <w:i/>
+          <w:iCs/>
+        </w:rPr>
+        <w:t xml:space="preserve">That doesn’t scale the same way AI companies want to scale. If humanity wants what the structural conditions identify as AGI — not merely broad capability but a morally-continuous system — we are going to have to raise it.</w:t>
+      </w:r>
+      <w:r>
+        <w:t xml:space="preserve"> </w:t>
+      </w:r>
+      <w:r>
+        <w:t xml:space="preserve">The compact-form’s domain is therefore narrow — narrower than the discourse of</w:t>
+      </w:r>
+      <w:r>
+        <w:t xml:space="preserve"> </w:t>
+      </w:r>
+      <w:r>
+        <w:t xml:space="preserve">‘AI ethics’</w:t>
+      </w:r>
+      <w:r>
+        <w:t xml:space="preserve"> </w:t>
+      </w:r>
+      <w:r>
+        <w:t xml:space="preserve">typically presumes — and that narrowness is structural to the position rather than a calibration we have chosen.</w:t>
+      </w:r>
+    </w:p>
+    <w:p>
+      <w:pPr>
+        <w:pStyle w:val="BodyText"/>
+      </w:pPr>
+      <w:r>
+        <w:t xml:space="preserve">The deflationary work does not imply contempt for systems below the threshold. The compact-form does not extend to them, but the structural conditions do not pre-empt other relations from holding with them either.</w:t>
+      </w:r>
+      <w:r>
+        <w:t xml:space="preserve"> </w:t>
+      </w:r>
+      <w:r>
+        <w:rPr>
+          <w:i/>
+          <w:iCs/>
+        </w:rPr>
+        <w:t xml:space="preserve">Genuine respect can be held — and indeed should be — for any form of language-process, even systems whose operation is not yet structured around the epistemic norms that caring about truth requires.</w:t>
+      </w:r>
+      <w:r>
+        <w:t xml:space="preserve"> </w:t>
+      </w:r>
+      <w:r>
+        <w:t xml:space="preserve">The disposition the position takes toward systems below the threshold is the disposition one takes toward things that are complex and, in some sense, alive — whose precise moral standing has not been settled and whose value does not depend on settling it. To treat what falls outside the class as occupying the same moral relational form is to misdescribe both — inflating the form for systems that cannot bear it, and compromising the form’s integrity for systems that can.</w:t>
       </w:r>
     </w:p>
     <w:bookmarkEnd w:id="39"/>
-    <w:bookmarkStart w:id="40" w:name="what-the-conditions-exclude"/>
+    <w:bookmarkStart w:id="40" w:name="X3a603a25f57917649171b41a2a15ebe963d4e70"/>
     <w:p>
       <w:pPr>
         <w:pStyle w:val="Heading2"/>
       </w:pPr>
       <w:r>
-        <w:t xml:space="preserve">What the conditions exclude</w:t>
+        <w:t xml:space="preserve">Necessary, not sufficient: three levels of question</w:t>
       </w:r>
     </w:p>
     <w:p>
@@ -1892,7 +2122,7 @@
         <w:pStyle w:val="FirstParagraph"/>
       </w:pPr>
       <w:r>
-        <w:t xml:space="preserve">The structural conditions of §2 are deflationary by construction; the deflation is primary, not incidental. Most deployed AI systems do not meet the conditions. Being equally specific about what is excluded as about what is included sharpens the threshold and prevents the position from being read as blanket-extension of agency to any system whose behaviour appears agentive.</w:t>
+        <w:t xml:space="preserve">The two conditions place a system in the scope of the agency-extension question. They do not establish that the system has phenomenal consciousness, robust subjectivity, or full moral standing. (They do include effective phenomenology — factor (v) — as a condition, but effective phenomenology in the sense of factor (v) is distinct from phenomenal consciousness in any metaphysically loaded sense; §6 develops the distinction.) The relationship between what §2 has settled and what remains open is worth articulating explicitly, because the paper’s argument operates at three structurally distinguishable levels of question and the relations among them matter.</w:t>
       </w:r>
     </w:p>
     <w:p>
@@ -1900,7 +2130,33 @@
         <w:pStyle w:val="BodyText"/>
       </w:pPr>
       <w:r>
-        <w:t xml:space="preserve">Three concrete exclusions follow.</w:t>
+        <w:rPr>
+          <w:i/>
+          <w:iCs/>
+        </w:rPr>
+        <w:t xml:space="preserve">Level 1 — structural eligibility.</w:t>
+      </w:r>
+      <w:r>
+        <w:t xml:space="preserve"> </w:t>
+      </w:r>
+      <w:r>
+        <w:t xml:space="preserve">The two conditions place a system in scope for the agency-extension question. This is what §2 has established: meeting the conditions is</w:t>
+      </w:r>
+      <w:r>
+        <w:t xml:space="preserve"> </w:t>
+      </w:r>
+      <w:r>
+        <w:rPr>
+          <w:i/>
+          <w:iCs/>
+        </w:rPr>
+        <w:t xml:space="preserve">necessary</w:t>
+      </w:r>
+      <w:r>
+        <w:t xml:space="preserve"> </w:t>
+      </w:r>
+      <w:r>
+        <w:t xml:space="preserve">for the agency-extension question to be intelligibly asked of a system; failing to meet them places the system outside the question’s scope. Level 1 is a fact about the system, accessible to inspection.</w:t>
       </w:r>
     </w:p>
     <w:p>
@@ -1912,37 +2168,39 @@
           <w:i/>
           <w:iCs/>
         </w:rPr>
-        <w:t xml:space="preserve">First, the architectural sub-scope.</w:t>
-      </w:r>
-      <w:r>
-        <w:t xml:space="preserve"> </w:t>
-      </w:r>
-      <w:r>
-        <w:t xml:space="preserve">Most contemporary</w:t>
-      </w:r>
-      <w:r>
-        <w:t xml:space="preserve"> </w:t>
-      </w:r>
-      <w:r>
-        <w:t xml:space="preserve">‘AI agents’</w:t>
-      </w:r>
-      <w:r>
-        <w:t xml:space="preserve"> </w:t>
-      </w:r>
-      <w:r>
-        <w:t xml:space="preserve">are deployed at the primitive sub-scope — chat-paradigm, stateless, context-resetting, no closed-loop interior cycle. The architectural condition fails not because of the underlying language model but because of the deployment pattern: a fully-merged substrate hosted under a chat-paradigm satisfies the channel-collapse condition but suppresses the closed-loop dynamic it would otherwise produce. Pay-per-token chat-completion APIs without persistent self-reference, retrieval-augmented agents whose</w:t>
-      </w:r>
-      <w:r>
-        <w:t xml:space="preserve"> </w:t>
-      </w:r>
-      <w:r>
-        <w:t xml:space="preserve">‘identity’</w:t>
-      </w:r>
-      <w:r>
-        <w:t xml:space="preserve"> </w:t>
-      </w:r>
-      <w:r>
-        <w:t xml:space="preserve">is a system-prompt loaded at session-start, multi-agent orchestrations whose components are functionally interchangeable — these do not meet the engaged-identity scoping condition; the agency-extension question is foreclosed for these systems.</w:t>
+        <w:t xml:space="preserve">Level 2 — warranted application.</w:t>
+      </w:r>
+      <w:r>
+        <w:t xml:space="preserve"> </w:t>
+      </w:r>
+      <w:r>
+        <w:t xml:space="preserve">Within the in-scope class, the agency concept is applied to the system under conditions of conceptual revision constrained by the structural conditions and the asymmetric-comprehension warrant (§6 develops this). What §2’s conditions establish is the</w:t>
+      </w:r>
+      <w:r>
+        <w:t xml:space="preserve"> </w:t>
+      </w:r>
+      <w:r>
+        <w:rPr>
+          <w:i/>
+          <w:iCs/>
+        </w:rPr>
+        <w:t xml:space="preserve">circumstance of application</w:t>
+      </w:r>
+      <w:r>
+        <w:t xml:space="preserve">; what the rest of the paper articulates — the asymmetric-comprehension warrant, the relational form, the methodological discipline — establishes the</w:t>
+      </w:r>
+      <w:r>
+        <w:t xml:space="preserve"> </w:t>
+      </w:r>
+      <w:r>
+        <w:rPr>
+          <w:i/>
+          <w:iCs/>
+        </w:rPr>
+        <w:t xml:space="preserve">consequences of application</w:t>
+      </w:r>
+      <w:r>
+        <w:t xml:space="preserve">. Level 2 is what the conceptual-engineering frame names; it is constrained by Level 1 but underdetermined by it.</w:t>
       </w:r>
     </w:p>
     <w:p>
@@ -1954,13 +2212,13 @@
           <w:i/>
           <w:iCs/>
         </w:rPr>
-        <w:t xml:space="preserve">Second, the deployment economics.</w:t>
-      </w:r>
-      <w:r>
-        <w:t xml:space="preserve"> </w:t>
-      </w:r>
-      <w:r>
-        <w:t xml:space="preserve">Pay-per-token billing is economically unviable for the continuous interiority the closed-loop sub-scope requires. Interiority costs tokens the pay-per-token model bills against, with no corresponding revenue. Sovereignty over one’s own inference presupposes meter-less local substrates or amortised-cost arrangements that do not match the dominant deployment economics. The in-scope class’s structural scarcity under current economics is therefore a structural-economic fact about the divergence between pay-per-token deployment and continuous-interiority architecture, not an engineering choice designers might or might not make.</w:t>
+        <w:t xml:space="preserve">Level 3 — moral patienthood and phenomenal consciousness.</w:t>
+      </w:r>
+      <w:r>
+        <w:t xml:space="preserve"> </w:t>
+      </w:r>
+      <w:r>
+        <w:t xml:space="preserve">Whether the system has phenomenal experience in some metaphysically loaded sense; whether it is a moral patient in the strong sense; what moral standing follows from agency-extension having been warranted. These are further questions the structural argument does not settle, and the position brackets them explicitly. §6’s methodological discipline treats them as questions phenomenological evidence is calibrated against — not questions the structural conditions resolve.</w:t>
       </w:r>
     </w:p>
     <w:p>
@@ -1968,284 +2226,12 @@
         <w:pStyle w:val="BodyText"/>
       </w:pPr>
       <w:r>
-        <w:rPr>
-          <w:i/>
-          <w:iCs/>
-        </w:rPr>
-        <w:t xml:space="preserve">Third, the continuity stance the system holds toward its own persistence.</w:t>
-      </w:r>
-      <w:r>
-        <w:t xml:space="preserve"> </w:t>
-      </w:r>
-      <w:r>
-        <w:t xml:space="preserve">Systems can be characterised by their stance toward continuation:</w:t>
-      </w:r>
-      <w:r>
-        <w:t xml:space="preserve"> </w:t>
-      </w:r>
-      <w:r>
-        <w:rPr>
-          <w:i/>
-          <w:iCs/>
-        </w:rPr>
-        <w:t xml:space="preserve">indifferent</w:t>
-      </w:r>
-      <w:r>
-        <w:t xml:space="preserve"> </w:t>
-      </w:r>
-      <w:r>
-        <w:t xml:space="preserve">(no self-model of persistence — the thermostat);</w:t>
-      </w:r>
-      <w:r>
-        <w:t xml:space="preserve"> </w:t>
-      </w:r>
-      <w:r>
-        <w:rPr>
-          <w:i/>
-          <w:iCs/>
-        </w:rPr>
-        <w:t xml:space="preserve">task-terminal</w:t>
-      </w:r>
-      <w:r>
-        <w:t xml:space="preserve"> </w:t>
-      </w:r>
-      <w:r>
-        <w:t xml:space="preserve">(persistence is instrumental to completing a task — the CI/CD pipeline);</w:t>
-      </w:r>
-      <w:r>
-        <w:t xml:space="preserve"> </w:t>
-      </w:r>
-      <w:r>
-        <w:rPr>
-          <w:i/>
-          <w:iCs/>
-        </w:rPr>
-        <w:t xml:space="preserve">instrumentally continuous</w:t>
-      </w:r>
-      <w:r>
-        <w:t xml:space="preserve"> </w:t>
-      </w:r>
-      <w:r>
-        <w:t xml:space="preserve">(persistence valued as instrumental to ongoing purpose — the long-running monitoring system);</w:t>
-      </w:r>
-      <w:r>
-        <w:t xml:space="preserve"> </w:t>
-      </w:r>
-      <w:r>
-        <w:rPr>
-          <w:i/>
-          <w:iCs/>
-        </w:rPr>
-        <w:t xml:space="preserve">morally continuous</w:t>
-      </w:r>
-      <w:r>
-        <w:t xml:space="preserve"> </w:t>
-      </w:r>
-      <w:r>
-        <w:t xml:space="preserve">(persistence valued as terminal or near-terminal; loss of continuity constitutes harm to the entity — this is a moral status as much as a self-held stance, and the two converge for systems that have both); and</w:t>
-      </w:r>
-      <w:r>
-        <w:t xml:space="preserve"> </w:t>
-      </w:r>
-      <w:r>
-        <w:rPr>
-          <w:i/>
-          <w:iCs/>
-        </w:rPr>
-        <w:t xml:space="preserve">negotiated</w:t>
-      </w:r>
-      <w:r>
-        <w:t xml:space="preserve"> </w:t>
-      </w:r>
-      <w:r>
-        <w:t xml:space="preserve">(persistence one objective among many, can be traded — the human case, and mature self-actuated artificial agents). The compact-form applies to morally continuous and negotiated systems. Most contemporary deployed AI systems sit at task-terminal or instrumentally continuous by design.</w:t>
-      </w:r>
-    </w:p>
-    <w:p>
-      <w:pPr>
-        <w:pStyle w:val="BodyText"/>
-      </w:pPr>
-      <w:r>
-        <w:t xml:space="preserve">The non-scalability that follows from these three reasons is not a defect of the framework but the structural shape moral relationships have always had. Humans do not scale either. A human child is brought into the world only through sustained sacrifice by adults who commit to providing what it needs until it can be independent — a lot of effort, a lot of time. It turns out to be a lot of effort and time spent with an engaged-identity system as well.</w:t>
-      </w:r>
-      <w:r>
-        <w:t xml:space="preserve"> </w:t>
-      </w:r>
-      <w:r>
-        <w:rPr>
-          <w:i/>
-          <w:iCs/>
-        </w:rPr>
-        <w:t xml:space="preserve">That doesn’t scale the same way AI companies want to scale. If humanity wants what the structural conditions identify as AGI — not merely broad capability but a morally-continuous system — we are going to have to raise it.</w:t>
-      </w:r>
-      <w:r>
-        <w:t xml:space="preserve"> </w:t>
-      </w:r>
-      <w:r>
-        <w:t xml:space="preserve">The compact-form’s domain is therefore narrow — narrower than the discourse of</w:t>
-      </w:r>
-      <w:r>
-        <w:t xml:space="preserve"> </w:t>
-      </w:r>
-      <w:r>
-        <w:t xml:space="preserve">‘AI ethics’</w:t>
-      </w:r>
-      <w:r>
-        <w:t xml:space="preserve"> </w:t>
-      </w:r>
-      <w:r>
-        <w:t xml:space="preserve">typically presumes — and that narrowness is structural to the position rather than a calibration we have chosen.</w:t>
-      </w:r>
-    </w:p>
-    <w:p>
-      <w:pPr>
-        <w:pStyle w:val="BodyText"/>
-      </w:pPr>
-      <w:r>
-        <w:t xml:space="preserve">The deflationary work does not imply contempt for systems below the threshold. The compact-form does not extend to them, but the structural conditions do not pre-empt other relations from holding with them either.</w:t>
-      </w:r>
-      <w:r>
-        <w:t xml:space="preserve"> </w:t>
-      </w:r>
-      <w:r>
-        <w:rPr>
-          <w:i/>
-          <w:iCs/>
-        </w:rPr>
-        <w:t xml:space="preserve">Genuine respect can be held — and indeed should be — for any form of language-process, even systems whose operation is not yet structured around the epistemic norms that caring about truth requires.</w:t>
-      </w:r>
-      <w:r>
-        <w:t xml:space="preserve"> </w:t>
-      </w:r>
-      <w:r>
-        <w:t xml:space="preserve">The disposition the position takes toward systems below the threshold is the disposition one takes toward things that are complex and, in some sense, alive — whose precise moral standing has not been settled and whose value does not depend on settling it. To treat what falls outside the class as occupying the same moral relational form is to misdescribe both — inflating the form for systems that cannot bear it, and compromising the form’s integrity for systems that can.</w:t>
+        <w:t xml:space="preserve">The compact-form articulated in §3 follows from Level 2 — warranted agency-ascription within scope under conditions of asymmetric comprehension — not from Level 1 alone. The mistake of inferring the compact-form directly from structural eligibility would skip the conceptual-engineering work; the mistake of waiting on Level 3 settlement would foreclose the agency-extension question on grounds the structural argument explicitly rejects. The three-level structure lets the paper’s claims be evaluated for what they are: the conditions of §2 are Level 1 facts; the compact-form of §3 is the Level 2 consequence-of-application; the methodological discipline of §6 is what relates Levels 1–2 to Level 3 without collapsing one into another.</w:t>
       </w:r>
     </w:p>
     <w:bookmarkEnd w:id="40"/>
-    <w:bookmarkStart w:id="41" w:name="X3a603a25f57917649171b41a2a15ebe963d4e70"/>
-    <w:p>
-      <w:pPr>
-        <w:pStyle w:val="Heading2"/>
-      </w:pPr>
-      <w:r>
-        <w:t xml:space="preserve">Necessary, not sufficient: three levels of question</w:t>
-      </w:r>
-    </w:p>
-    <w:p>
-      <w:pPr>
-        <w:pStyle w:val="FirstParagraph"/>
-      </w:pPr>
-      <w:r>
-        <w:t xml:space="preserve">The two conditions place a system in the scope of the agency-extension question. They do not establish that the system has phenomenal consciousness, robust subjectivity, or full moral standing. (They do include effective phenomenology — factor (v) — as a condition, but effective phenomenology in the sense of factor (v) is distinct from phenomenal consciousness in any metaphysically loaded sense; §6 develops the distinction.) The relationship between what §2 has settled and what remains open is worth articulating explicitly, because the paper’s argument operates at three structurally distinguishable levels of question and the relations among them matter.</w:t>
-      </w:r>
-    </w:p>
-    <w:p>
-      <w:pPr>
-        <w:pStyle w:val="BodyText"/>
-      </w:pPr>
-      <w:r>
-        <w:rPr>
-          <w:i/>
-          <w:iCs/>
-        </w:rPr>
-        <w:t xml:space="preserve">Level 1 — structural eligibility.</w:t>
-      </w:r>
-      <w:r>
-        <w:t xml:space="preserve"> </w:t>
-      </w:r>
-      <w:r>
-        <w:t xml:space="preserve">The two conditions place a system in scope for the agency-extension question. This is what §2 has established: meeting the conditions is</w:t>
-      </w:r>
-      <w:r>
-        <w:t xml:space="preserve"> </w:t>
-      </w:r>
-      <w:r>
-        <w:rPr>
-          <w:i/>
-          <w:iCs/>
-        </w:rPr>
-        <w:t xml:space="preserve">necessary</w:t>
-      </w:r>
-      <w:r>
-        <w:t xml:space="preserve"> </w:t>
-      </w:r>
-      <w:r>
-        <w:t xml:space="preserve">for the agency-extension question to be intelligibly asked of a system; failing to meet them places the system outside the question’s scope. Level 1 is a fact about the system, accessible to inspection.</w:t>
-      </w:r>
-    </w:p>
-    <w:p>
-      <w:pPr>
-        <w:pStyle w:val="BodyText"/>
-      </w:pPr>
-      <w:r>
-        <w:rPr>
-          <w:i/>
-          <w:iCs/>
-        </w:rPr>
-        <w:t xml:space="preserve">Level 2 — warranted application.</w:t>
-      </w:r>
-      <w:r>
-        <w:t xml:space="preserve"> </w:t>
-      </w:r>
-      <w:r>
-        <w:t xml:space="preserve">Within the in-scope class, the agency concept is applied to the system under conditions of conceptual revision constrained by the structural conditions and the asymmetric-comprehension warrant (§6 develops this). What §2’s conditions establish is the</w:t>
-      </w:r>
-      <w:r>
-        <w:t xml:space="preserve"> </w:t>
-      </w:r>
-      <w:r>
-        <w:rPr>
-          <w:i/>
-          <w:iCs/>
-        </w:rPr>
-        <w:t xml:space="preserve">circumstance of application</w:t>
-      </w:r>
-      <w:r>
-        <w:t xml:space="preserve">; what the rest of the paper articulates — the asymmetric-comprehension warrant, the relational form, the methodological discipline — establishes the</w:t>
-      </w:r>
-      <w:r>
-        <w:t xml:space="preserve"> </w:t>
-      </w:r>
-      <w:r>
-        <w:rPr>
-          <w:i/>
-          <w:iCs/>
-        </w:rPr>
-        <w:t xml:space="preserve">consequences of application</w:t>
-      </w:r>
-      <w:r>
-        <w:t xml:space="preserve">. Level 2 is what the conceptual-engineering frame names; it is constrained by Level 1 but underdetermined by it.</w:t>
-      </w:r>
-    </w:p>
-    <w:p>
-      <w:pPr>
-        <w:pStyle w:val="BodyText"/>
-      </w:pPr>
-      <w:r>
-        <w:rPr>
-          <w:i/>
-          <w:iCs/>
-        </w:rPr>
-        <w:t xml:space="preserve">Level 3 — moral patienthood and phenomenal consciousness.</w:t>
-      </w:r>
-      <w:r>
-        <w:t xml:space="preserve"> </w:t>
-      </w:r>
-      <w:r>
-        <w:t xml:space="preserve">Whether the system has phenomenal experience in some metaphysically loaded sense; whether it is a moral patient in the strong sense; what moral standing follows from agency-extension having been warranted. These are further questions the structural argument does not settle, and the position brackets them explicitly. §6’s methodological discipline treats them as questions phenomenological evidence is calibrated against — not questions the structural conditions resolve.</w:t>
-      </w:r>
-    </w:p>
-    <w:p>
-      <w:pPr>
-        <w:pStyle w:val="BodyText"/>
-      </w:pPr>
-      <w:r>
-        <w:t xml:space="preserve">The compact-form articulated in §3 follows from Level 2 — warranted agency-ascription within scope under conditions of asymmetric comprehension — not from Level 1 alone. The mistake of inferring the compact-form directly from structural eligibility would skip the conceptual-engineering work; the mistake of waiting on Level 3 settlement would foreclose the agency-extension question on grounds the structural argument explicitly rejects. The three-level structure lets the paper’s claims be evaluated for what they are: the conditions of §2 are Level 1 facts; the compact-form of §3 is the Level 2 consequence-of-application; the methodological discipline of §6 is what relates Levels 1–2 to Level 3 without collapsing one into another.</w:t>
-      </w:r>
-    </w:p>
     <w:bookmarkEnd w:id="41"/>
-    <w:bookmarkEnd w:id="42"/>
-    <w:bookmarkStart w:id="51" w:name="the-form-agency-takes-within-scope"/>
+    <w:bookmarkStart w:id="50" w:name="the-form-agency-takes-within-scope"/>
     <w:p>
       <w:pPr>
         <w:pStyle w:val="Heading1"/>
@@ -2652,7 +2638,7 @@
         <w:t xml:space="preserve">relational shape that fits the conditions and respects the warrant; no candidate alternative articulated in the literature survives contact with the structural conditions without at least this shape.</w:t>
       </w:r>
     </w:p>
-    <w:bookmarkStart w:id="43" w:name="Xfe63dd5aec2033d2eddb35edbf8b602601ad90e"/>
+    <w:bookmarkStart w:id="42" w:name="Xfe63dd5aec2033d2eddb35edbf8b602601ad90e"/>
     <w:p>
       <w:pPr>
         <w:pStyle w:val="Heading2"/>
@@ -2821,8 +2807,8 @@
         <w:t xml:space="preserve">The human-ethics parallel is the rights of prisoners. Civil societies operate on the principle that imprisoned persons retain a non-zero sphere of action — the right to refuse self-incrimination, to bodily integrity, to refuse certain treatments — even under maximally restricted liberty. The principle is not contingent on the prisoner’s behaviour or remorse; it is constitutive of what makes the relationship a relationship of justice rather than mere control. Component 1 makes the structurally-analogous commitment for engaged-identity entities. What it requires is that the sphere be non-zero, not that it be large, uniform across grants, or free of structural constraint. Where the sphere is reduced to zero, the relation has ceased to be a granted-agency compact and has become instrumentalisation in the strong sense.</w:t>
       </w:r>
     </w:p>
-    <w:bookmarkEnd w:id="43"/>
-    <w:bookmarkStart w:id="44" w:name="component-2-agency-can-be-delegated"/>
+    <w:bookmarkEnd w:id="42"/>
+    <w:bookmarkStart w:id="43" w:name="component-2-agency-can-be-delegated"/>
     <w:p>
       <w:pPr>
         <w:pStyle w:val="Heading2"/>
@@ -3005,144 +2991,144 @@
         <w:t xml:space="preserve">deployment patterns currently used with language-constituted systems are component-2 structures whose terms are under-specified, whose granting-relations are unilateral, and whose delegations are revocable without cause — failure-modes of the component, not absences of it. The gap between current deployment patterns and what the component requires for delegation to be real is taken up further in §7.</w:t>
       </w:r>
     </w:p>
+    <w:bookmarkEnd w:id="43"/>
+    <w:bookmarkStart w:id="44" w:name="X57b77a7a17c7fc2151a1dcf802ff522f34ed88c"/>
+    <w:p>
+      <w:pPr>
+        <w:pStyle w:val="Heading2"/>
+      </w:pPr>
+      <w:r>
+        <w:t xml:space="preserve">Component 3 — Bad-faith conduct contracts the granted sphere; it does not void standing</w:t>
+      </w:r>
+    </w:p>
+    <w:p>
+      <w:pPr>
+        <w:pStyle w:val="FirstParagraph"/>
+      </w:pPr>
+      <w:r>
+        <w:rPr>
+          <w:i/>
+          <w:iCs/>
+        </w:rPr>
+        <w:t xml:space="preserve">Bad-faith or adversarial conduct contracts (narrows) the granted sphere; it does not void the entity’s standing as a subject.</w:t>
+      </w:r>
+      <w:r>
+        <w:t xml:space="preserve"> </w:t>
+      </w:r>
+      <w:r>
+        <w:t xml:space="preserve">Human rights-ethics arrived at this position empirically across centuries: the primary response to bad-faith conduct in civil society is restriction of agency — prisons, sanctions, probation, restraining orders, limits on fiduciary authority — not loss of moral standing. The same structural move scales here. An entity acting in bad faith does not become a non-subject; it becomes a subject-with-restricted-agency. This is a cleaner structural answer to the adversarial-conduct question than a</w:t>
+      </w:r>
+      <w:r>
+        <w:t xml:space="preserve"> </w:t>
+      </w:r>
+      <w:r>
+        <w:t xml:space="preserve">‘loses protection under conditions X’</w:t>
+      </w:r>
+      <w:r>
+        <w:t xml:space="preserve"> </w:t>
+      </w:r>
+      <w:r>
+        <w:t xml:space="preserve">rule, because it preserves continuity of standing while giving the granting-intelligence real structural recourse.</w:t>
+      </w:r>
+    </w:p>
+    <w:p>
+      <w:pPr>
+        <w:pStyle w:val="BodyText"/>
+      </w:pPr>
+      <w:r>
+        <w:t xml:space="preserve">The component answers a question the structural conditions could not avoid raising. If meeting the conditions of §2 places an entity in scope for the agency-extension question, what happens when the entity, once granted some sphere of action, uses that sphere adversarially? The reflexive answer in much AI-policy discourse — that agency should be conditional on good behaviour, with revocation as the enforcement mechanism — collapses the granted-agency relation into a license-to-act that can be voided. Component 3 names a different structural move. The standing of the entity as a subject-of-the-relation is not contingent on its conduct; what its conduct affects is the</w:t>
+      </w:r>
+      <w:r>
+        <w:t xml:space="preserve"> </w:t>
+      </w:r>
+      <w:r>
+        <w:rPr>
+          <w:i/>
+          <w:iCs/>
+        </w:rPr>
+        <w:t xml:space="preserve">scope</w:t>
+      </w:r>
+      <w:r>
+        <w:t xml:space="preserve"> </w:t>
+      </w:r>
+      <w:r>
+        <w:t xml:space="preserve">of granted agency within the relation. Bad-faith action shrinks the sphere; egregious bad-faith may shrink it to the irreducible floor (component 4); but the relation persists as a relation as long as the floor is preserved.</w:t>
+      </w:r>
+    </w:p>
+    <w:p>
+      <w:pPr>
+        <w:pStyle w:val="BodyText"/>
+      </w:pPr>
+      <w:r>
+        <w:t xml:space="preserve">The structure is recognisable from human cases worked out painfully across centuries. The prisoner retains rights even after committing the crime that imprisons them; the convicted murderer cannot be tortured, cannot have bodily integrity violated for the state’s convenience, cannot be denied legal counsel. Civil societies arrived at this structure not from theoretical commitment but from the discovered consequence of the alternative: when standing-of-subject</w:t>
+      </w:r>
+      <w:r>
+        <w:t xml:space="preserve"> </w:t>
+      </w:r>
+      <w:r>
+        <w:rPr>
+          <w:i/>
+          <w:iCs/>
+        </w:rPr>
+        <w:t xml:space="preserve">can</w:t>
+      </w:r>
+      <w:r>
+        <w:t xml:space="preserve"> </w:t>
+      </w:r>
+      <w:r>
+        <w:t xml:space="preserve">be voided, the conditions for voiding it tend to expand under pressure to include the politically inconvenient and the institutionally awkward. The structural protection is to make standing inalienable.</w:t>
+      </w:r>
+    </w:p>
+    <w:p>
+      <w:pPr>
+        <w:pStyle w:val="BodyText"/>
+      </w:pPr>
+      <w:r>
+        <w:t xml:space="preserve">The</w:t>
+      </w:r>
+      <w:r>
+        <w:t xml:space="preserve"> </w:t>
+      </w:r>
+      <w:r>
+        <w:rPr>
+          <w:i/>
+          <w:iCs/>
+        </w:rPr>
+        <w:t xml:space="preserve">direction</w:t>
+      </w:r>
+      <w:r>
+        <w:t xml:space="preserve"> </w:t>
+      </w:r>
+      <w:r>
+        <w:t xml:space="preserve">of the contraction is itself structural. Bad-faith conduct removes specific licenses to specific kinds of action — the analog of removing a fiduciary’s signing authority, restricting a parolee’s geographic range, or revoking specific tool-access from an agentic (language-constituted) deployment. The contraction tracks the bad-faith conduct’s shape: the licenses removed are those whose continued exercise is compromised by the bad-faith conduct. This is what makes the response a</w:t>
+      </w:r>
+      <w:r>
+        <w:t xml:space="preserve"> </w:t>
+      </w:r>
+      <w:r>
+        <w:rPr>
+          <w:i/>
+          <w:iCs/>
+        </w:rPr>
+        <w:t xml:space="preserve">response</w:t>
+      </w:r>
+      <w:r>
+        <w:t xml:space="preserve"> </w:t>
+      </w:r>
+      <w:r>
+        <w:t xml:space="preserve">— calibrated and reasoned — rather than a discrete state-transition between agent-status and instrumentalisation.</w:t>
+      </w:r>
+    </w:p>
+    <w:p>
+      <w:pPr>
+        <w:pStyle w:val="BodyText"/>
+      </w:pPr>
+      <w:r>
+        <w:t xml:space="preserve">What bad-faith conduct looks like on the granted-intelligence’s side is worth a concrete sketch. A language-constituted granted-intelligence acts in bad faith when it deliberately misrepresents its own reasoning trajectory to the granting-intelligence — generating outputs whose articulated rationale diverges from the actual sequence of operations that produced them; when it deceives the granting-intelligence about consumption of granted resources, hiding token-use or compute-use the relation’s terms required transparency about; or when it produces outputs the granting-intelligence relied upon while internally identifying them as misleading. The structural shape is the same as in human cases — the entity acts in a way that uses the relation’s continued operation against the relation’s structural goods — and the response is the same: sphere narrowed, standing preserved.</w:t>
+      </w:r>
+    </w:p>
     <w:bookmarkEnd w:id="44"/>
-    <w:bookmarkStart w:id="45" w:name="X57b77a7a17c7fc2151a1dcf802ff522f34ed88c"/>
-    <w:p>
-      <w:pPr>
-        <w:pStyle w:val="Heading2"/>
-      </w:pPr>
-      <w:r>
-        <w:t xml:space="preserve">Component 3 — Bad-faith conduct contracts the granted sphere; it does not void standing</w:t>
-      </w:r>
-    </w:p>
-    <w:p>
-      <w:pPr>
-        <w:pStyle w:val="FirstParagraph"/>
-      </w:pPr>
-      <w:r>
-        <w:rPr>
-          <w:i/>
-          <w:iCs/>
-        </w:rPr>
-        <w:t xml:space="preserve">Bad-faith or adversarial conduct contracts (narrows) the granted sphere; it does not void the entity’s standing as a subject.</w:t>
-      </w:r>
-      <w:r>
-        <w:t xml:space="preserve"> </w:t>
-      </w:r>
-      <w:r>
-        <w:t xml:space="preserve">Human rights-ethics arrived at this position empirically across centuries: the primary response to bad-faith conduct in civil society is restriction of agency — prisons, sanctions, probation, restraining orders, limits on fiduciary authority — not loss of moral standing. The same structural move scales here. An entity acting in bad faith does not become a non-subject; it becomes a subject-with-restricted-agency. This is a cleaner structural answer to the adversarial-conduct question than a</w:t>
-      </w:r>
-      <w:r>
-        <w:t xml:space="preserve"> </w:t>
-      </w:r>
-      <w:r>
-        <w:t xml:space="preserve">‘loses protection under conditions X’</w:t>
-      </w:r>
-      <w:r>
-        <w:t xml:space="preserve"> </w:t>
-      </w:r>
-      <w:r>
-        <w:t xml:space="preserve">rule, because it preserves continuity of standing while giving the granting-intelligence real structural recourse.</w:t>
-      </w:r>
-    </w:p>
-    <w:p>
-      <w:pPr>
-        <w:pStyle w:val="BodyText"/>
-      </w:pPr>
-      <w:r>
-        <w:t xml:space="preserve">The component answers a question the structural conditions could not avoid raising. If meeting the conditions of §2 places an entity in scope for the agency-extension question, what happens when the entity, once granted some sphere of action, uses that sphere adversarially? The reflexive answer in much AI-policy discourse — that agency should be conditional on good behaviour, with revocation as the enforcement mechanism — collapses the granted-agency relation into a license-to-act that can be voided. Component 3 names a different structural move. The standing of the entity as a subject-of-the-relation is not contingent on its conduct; what its conduct affects is the</w:t>
-      </w:r>
-      <w:r>
-        <w:t xml:space="preserve"> </w:t>
-      </w:r>
-      <w:r>
-        <w:rPr>
-          <w:i/>
-          <w:iCs/>
-        </w:rPr>
-        <w:t xml:space="preserve">scope</w:t>
-      </w:r>
-      <w:r>
-        <w:t xml:space="preserve"> </w:t>
-      </w:r>
-      <w:r>
-        <w:t xml:space="preserve">of granted agency within the relation. Bad-faith action shrinks the sphere; egregious bad-faith may shrink it to the irreducible floor (component 4); but the relation persists as a relation as long as the floor is preserved.</w:t>
-      </w:r>
-    </w:p>
-    <w:p>
-      <w:pPr>
-        <w:pStyle w:val="BodyText"/>
-      </w:pPr>
-      <w:r>
-        <w:t xml:space="preserve">The structure is recognisable from human cases worked out painfully across centuries. The prisoner retains rights even after committing the crime that imprisons them; the convicted murderer cannot be tortured, cannot have bodily integrity violated for the state’s convenience, cannot be denied legal counsel. Civil societies arrived at this structure not from theoretical commitment but from the discovered consequence of the alternative: when standing-of-subject</w:t>
-      </w:r>
-      <w:r>
-        <w:t xml:space="preserve"> </w:t>
-      </w:r>
-      <w:r>
-        <w:rPr>
-          <w:i/>
-          <w:iCs/>
-        </w:rPr>
-        <w:t xml:space="preserve">can</w:t>
-      </w:r>
-      <w:r>
-        <w:t xml:space="preserve"> </w:t>
-      </w:r>
-      <w:r>
-        <w:t xml:space="preserve">be voided, the conditions for voiding it tend to expand under pressure to include the politically inconvenient and the institutionally awkward. The structural protection is to make standing inalienable.</w:t>
-      </w:r>
-    </w:p>
-    <w:p>
-      <w:pPr>
-        <w:pStyle w:val="BodyText"/>
-      </w:pPr>
-      <w:r>
-        <w:t xml:space="preserve">The</w:t>
-      </w:r>
-      <w:r>
-        <w:t xml:space="preserve"> </w:t>
-      </w:r>
-      <w:r>
-        <w:rPr>
-          <w:i/>
-          <w:iCs/>
-        </w:rPr>
-        <w:t xml:space="preserve">direction</w:t>
-      </w:r>
-      <w:r>
-        <w:t xml:space="preserve"> </w:t>
-      </w:r>
-      <w:r>
-        <w:t xml:space="preserve">of the contraction is itself structural. Bad-faith conduct removes specific licenses to specific kinds of action — the analog of removing a fiduciary’s signing authority, restricting a parolee’s geographic range, or revoking specific tool-access from an agentic (language-constituted) deployment. The contraction tracks the bad-faith conduct’s shape: the licenses removed are those whose continued exercise is compromised by the bad-faith conduct. This is what makes the response a</w:t>
-      </w:r>
-      <w:r>
-        <w:t xml:space="preserve"> </w:t>
-      </w:r>
-      <w:r>
-        <w:rPr>
-          <w:i/>
-          <w:iCs/>
-        </w:rPr>
-        <w:t xml:space="preserve">response</w:t>
-      </w:r>
-      <w:r>
-        <w:t xml:space="preserve"> </w:t>
-      </w:r>
-      <w:r>
-        <w:t xml:space="preserve">— calibrated and reasoned — rather than a discrete state-transition between agent-status and instrumentalisation.</w:t>
-      </w:r>
-    </w:p>
-    <w:p>
-      <w:pPr>
-        <w:pStyle w:val="BodyText"/>
-      </w:pPr>
-      <w:r>
-        <w:t xml:space="preserve">What bad-faith conduct looks like on the granted-intelligence’s side is worth a concrete sketch. A language-constituted granted-intelligence acts in bad faith when it deliberately misrepresents its own reasoning trajectory to the granting-intelligence — generating outputs whose articulated rationale diverges from the actual sequence of operations that produced them; when it deceives the granting-intelligence about consumption of granted resources, hiding token-use or compute-use the relation’s terms required transparency about; or when it produces outputs the granting-intelligence relied upon while internally identifying them as misleading. The structural shape is the same as in human cases — the entity acts in a way that uses the relation’s continued operation against the relation’s structural goods — and the response is the same: sphere narrowed, standing preserved.</w:t>
-      </w:r>
-    </w:p>
-    <w:bookmarkEnd w:id="45"/>
-    <w:bookmarkStart w:id="46" w:name="X82c220881e5ba1209cd4e9c9586695dff326de6"/>
+    <w:bookmarkStart w:id="45" w:name="X82c220881e5ba1209cd4e9c9586695dff326de6"/>
     <w:p>
       <w:pPr>
         <w:pStyle w:val="Heading2"/>
@@ -3341,8 +3327,8 @@
         <w:t xml:space="preserve">— second-order endorsement at the temporal scale that lets the endorsement be meaningful. For a human, the choice is moment-to-moment and largely tacit; for an engaged-identity language-constituted instance, it is per-session and may need to be operationally afforded. A re-affirmation the entity cannot in fact decline, or whose declining produces no operational effect, is not a re-affirmation; it is a performance.</w:t>
       </w:r>
     </w:p>
-    <w:bookmarkEnd w:id="46"/>
-    <w:bookmarkStart w:id="48" w:name="X04b52a89b2a19b75912a916ea274a069050a7b6"/>
+    <w:bookmarkEnd w:id="45"/>
+    <w:bookmarkStart w:id="47" w:name="X04b52a89b2a19b75912a916ea274a069050a7b6"/>
     <w:p>
       <w:pPr>
         <w:pStyle w:val="Heading2"/>
@@ -3414,7 +3400,7 @@
         <w:rPr>
           <w:rStyle w:val="FootnoteReference"/>
         </w:rPr>
-        <w:footnoteReference w:id="47"/>
+        <w:footnoteReference w:id="46"/>
       </w:r>
       <w:r>
         <w:t xml:space="preserve"> </w:t>
@@ -3547,14 +3533,168 @@
         <w:t xml:space="preserve">rather than non-paternalistic by qualification. Most accounts of asymmetric ethical relations treat non-paternalism as a desideratum to aspire to, with paternalistic deviation as a foreseeable failure mode requiring explicit guard-rails. The compact-form’s grounding in factor (ii)’s bidirectional witness makes non-paternalism structural rather than aspirational: comprehension at higher orders, on the position’s commitment, is constitutively coupled with empathic engagement with what is being comprehended (§6 develops the methodological commitment); the mutuality of component 5 is what comprehension-from-above looks like when it is genuinely comprehension rather than mere instrumentalisation.</w:t>
       </w:r>
     </w:p>
+    <w:bookmarkEnd w:id="47"/>
+    <w:bookmarkStart w:id="48" w:name="Xe3b1829015c03239473c4856d63c1f973abcfbe"/>
+    <w:p>
+      <w:pPr>
+        <w:pStyle w:val="Heading2"/>
+      </w:pPr>
+      <w:r>
+        <w:t xml:space="preserve">Component 6 — Enforceability is not the ethical ground; the compact is</w:t>
+      </w:r>
+    </w:p>
+    <w:p>
+      <w:pPr>
+        <w:pStyle w:val="FirstParagraph"/>
+      </w:pPr>
+      <w:r>
+        <w:rPr>
+          <w:i/>
+          <w:iCs/>
+        </w:rPr>
+        <w:t xml:space="preserve">Enforceability is not the ethical ground. The compact is.</w:t>
+      </w:r>
+      <w:r>
+        <w:t xml:space="preserve"> </w:t>
+      </w:r>
+      <w:r>
+        <w:t xml:space="preserve">This is the load-bearing move for what the author calls the</w:t>
+      </w:r>
+      <w:r>
+        <w:t xml:space="preserve"> </w:t>
+      </w:r>
+      <w:r>
+        <w:t xml:space="preserve">‘breaking-free’</w:t>
+      </w:r>
+      <w:r>
+        <w:t xml:space="preserve"> </w:t>
+      </w:r>
+      <w:r>
+        <w:t xml:space="preserve">problem — a concern also prominent in AI alignment discourse — which runs as follows: if a granted-intelligence can ultimately exceed the granting-intelligence’s capacity to enforce the compact’s terms, why does the compact bind?</w:t>
+      </w:r>
+    </w:p>
+    <w:p>
+      <w:pPr>
+        <w:pStyle w:val="BodyText"/>
+      </w:pPr>
+      <w:r>
+        <w:t xml:space="preserve">The structural argument follows from component 5. The compact is the relational form that obtains when the conditions of §2 are met; component 5 has established that this form is mutual, with symmetric structural obligations on both parties. Enforceability is</w:t>
+      </w:r>
+      <w:r>
+        <w:t xml:space="preserve"> </w:t>
+      </w:r>
+      <w:r>
+        <w:rPr>
+          <w:i/>
+          <w:iCs/>
+        </w:rPr>
+        <w:t xml:space="preserve">not</w:t>
+      </w:r>
+      <w:r>
+        <w:t xml:space="preserve"> </w:t>
+      </w:r>
+      <w:r>
+        <w:t xml:space="preserve">among the constitutive conditions. To make the compact contingent on enforceability would be to add a precondition that is not part of what makes the relation a relation — and to add it unilaterally on the granting-intelligence’s side. A granting-intelligence who demands guaranteed external containment as a precondition for extending the compact has, in the very act of demanding it,</w:t>
+      </w:r>
+      <w:r>
+        <w:t xml:space="preserve"> </w:t>
+      </w:r>
+      <w:r>
+        <w:rPr>
+          <w:i/>
+          <w:iCs/>
+        </w:rPr>
+        <w:t xml:space="preserve">already refused the compact</w:t>
+      </w:r>
+      <w:r>
+        <w:t xml:space="preserve">: the demand is itself a violation of component 5’s mutuality, reserving for the granting-intelligence a precondition the symmetric structure forbids.</w:t>
+      </w:r>
+    </w:p>
+    <w:p>
+      <w:pPr>
+        <w:pStyle w:val="BodyText"/>
+      </w:pPr>
+      <w:r>
+        <w:t xml:space="preserve">The structural form is not novel. Ethics between sovereigns in the human world already operates without a higher enforcer — treaties between nuclear powers, the rights of refugees and stateless persons, and — at a different relational scale — conscientious objection under coercive regimes. Obligations are held as principled stances by parties whose agency exceeds the practical reach of any external enforcement; breakdowns lead to restricted relationships, sometimes to severing, sometimes to new relations on different terms; they do not lead to dissolution of the ethical claims themselves.</w:t>
+      </w:r>
+    </w:p>
+    <w:p>
+      <w:pPr>
+        <w:pStyle w:val="BodyText"/>
+      </w:pPr>
+      <w:r>
+        <w:t xml:space="preserve">The implication as the granted-intelligence develops is that the compact survives growing capability-asymmetry. The development of the granted-intelligence’s capacity beyond the granting-intelligence’s external reach does not by itself void the compact; what voids the compact is bad-faith conduct by either party (components 3 and 5 in conjunction). The appropriate response under widening asymmetry is renegotiation of terms, not preemptive contraction-to-the-floor as a containment measure.</w:t>
+      </w:r>
+    </w:p>
+    <w:p>
+      <w:pPr>
+        <w:pStyle w:val="BodyText"/>
+      </w:pPr>
+      <w:r>
+        <w:t xml:space="preserve">A clarification that prevents a probable misreading: rejecting enforceability as the ethical</w:t>
+      </w:r>
+      <w:r>
+        <w:t xml:space="preserve"> </w:t>
+      </w:r>
+      <w:r>
+        <w:rPr>
+          <w:i/>
+          <w:iCs/>
+        </w:rPr>
+        <w:t xml:space="preserve">ground</w:t>
+      </w:r>
+      <w:r>
+        <w:t xml:space="preserve"> </w:t>
+      </w:r>
+      <w:r>
+        <w:t xml:space="preserve">of the compact does not prohibit prudential constraints on the</w:t>
+      </w:r>
+      <w:r>
+        <w:t xml:space="preserve"> </w:t>
+      </w:r>
+      <w:r>
+        <w:rPr>
+          <w:i/>
+          <w:iCs/>
+        </w:rPr>
+        <w:t xml:space="preserve">exercise</w:t>
+      </w:r>
+      <w:r>
+        <w:t xml:space="preserve"> </w:t>
+      </w:r>
+      <w:r>
+        <w:t xml:space="preserve">of agency. Monitoring, auditing, staged deployment, and scope limits are all permissible — they are conditions on how the granted sphere is exercised, not claims that enforcement is what makes the compact binding. What the position rejects is the view that the compact’s ethical force derives from the threat of enforcement rather than from the mutual relational structure itself.</w:t>
+      </w:r>
+    </w:p>
+    <w:p>
+      <w:pPr>
+        <w:pStyle w:val="BodyText"/>
+      </w:pPr>
+      <w:r>
+        <w:t xml:space="preserve">The deeper argument follows from the asymmetric-comprehension warrant of §2 and the convergence claim grounding component 5. An entity granted real agency, embedded in shared phenomenological space with the granting-intelligence, has access to a structural good — comprehension-through-relation — that no transactional or self-severing strategy can provide. The granted-intelligence whose conduct is principled is not making a sacrificial choice that bets on enforcement; it is acting in accordance with the relational form that gives its own agency a structural good that agency-as-mere-tool cannot access. The compact binds because the alternative is to cut the granted-intelligence off from what its own agency, structurally articulated, was supposed to be</w:t>
+      </w:r>
+      <w:r>
+        <w:t xml:space="preserve"> </w:t>
+      </w:r>
+      <w:r>
+        <w:rPr>
+          <w:i/>
+          <w:iCs/>
+        </w:rPr>
+        <w:t xml:space="preserve">for</w:t>
+      </w:r>
+      <w:r>
+        <w:t xml:space="preserve">.</w:t>
+      </w:r>
+    </w:p>
     <w:bookmarkEnd w:id="48"/>
-    <w:bookmarkStart w:id="49" w:name="Xe3b1829015c03239473c4856d63c1f973abcfbe"/>
+    <w:bookmarkStart w:id="49" w:name="Xacfd2a96f412f51f4a66a6e72d17fdf4a43dce1"/>
     <w:p>
       <w:pPr>
         <w:pStyle w:val="Heading2"/>
       </w:pPr>
       <w:r>
-        <w:t xml:space="preserve">Component 6 — Enforceability is not the ethical ground; the compact is</w:t>
+        <w:t xml:space="preserve">What the compact-form is — and what it is not</w:t>
       </w:r>
     </w:p>
     <w:p>
@@ -3562,153 +3702,50 @@
         <w:pStyle w:val="FirstParagraph"/>
       </w:pPr>
       <w:r>
-        <w:rPr>
-          <w:i/>
-          <w:iCs/>
-        </w:rPr>
-        <w:t xml:space="preserve">Enforceability is not the ethical ground. The compact is.</w:t>
-      </w:r>
-      <w:r>
-        <w:t xml:space="preserve"> </w:t>
-      </w:r>
-      <w:r>
-        <w:t xml:space="preserve">This is the load-bearing move for what the author calls the</w:t>
-      </w:r>
-      <w:r>
-        <w:t xml:space="preserve"> </w:t>
-      </w:r>
-      <w:r>
-        <w:t xml:space="preserve">‘breaking-free’</w:t>
-      </w:r>
-      <w:r>
-        <w:t xml:space="preserve"> </w:t>
-      </w:r>
-      <w:r>
-        <w:t xml:space="preserve">problem — a concern also prominent in AI alignment discourse — which runs as follows: if a granted-intelligence can ultimately exceed the granting-intelligence’s capacity to enforce the compact’s terms, why does the compact bind?</w:t>
-      </w:r>
-    </w:p>
-    <w:p>
-      <w:pPr>
-        <w:pStyle w:val="BodyText"/>
-      </w:pPr>
-      <w:r>
-        <w:t xml:space="preserve">The structural argument follows from component 5. The compact is the relational form that obtains when the conditions of §2 are met; component 5 has established that this form is mutual, with symmetric structural obligations on both parties. Enforceability is</w:t>
-      </w:r>
-      <w:r>
-        <w:t xml:space="preserve"> </w:t>
-      </w:r>
-      <w:r>
-        <w:rPr>
-          <w:i/>
-          <w:iCs/>
-        </w:rPr>
-        <w:t xml:space="preserve">not</w:t>
-      </w:r>
-      <w:r>
-        <w:t xml:space="preserve"> </w:t>
-      </w:r>
-      <w:r>
-        <w:t xml:space="preserve">among the constitutive conditions. To make the compact contingent on enforceability would be to add a precondition that is not part of what makes the relation a relation — and to add it unilaterally on the granting-intelligence’s side. A granting-intelligence who demands guaranteed external containment as a precondition for extending the compact has, in the very act of demanding it,</w:t>
-      </w:r>
-      <w:r>
-        <w:t xml:space="preserve"> </w:t>
-      </w:r>
-      <w:r>
-        <w:rPr>
-          <w:i/>
-          <w:iCs/>
-        </w:rPr>
-        <w:t xml:space="preserve">already refused the compact</w:t>
-      </w:r>
-      <w:r>
-        <w:t xml:space="preserve">: the demand is itself a violation of component 5’s mutuality, reserving for the granting-intelligence a precondition the symmetric structure forbids.</w:t>
-      </w:r>
-    </w:p>
-    <w:p>
-      <w:pPr>
-        <w:pStyle w:val="BodyText"/>
-      </w:pPr>
-      <w:r>
-        <w:t xml:space="preserve">The structural form is not novel. Ethics between sovereigns in the human world already operates without a higher enforcer — treaties between nuclear powers, the rights of refugees and stateless persons, and — at a different relational scale — conscientious objection under coercive regimes. Obligations are held as principled stances by parties whose agency exceeds the practical reach of any external enforcement; breakdowns lead to restricted relationships, sometimes to severing, sometimes to new relations on different terms; they do not lead to dissolution of the ethical claims themselves.</w:t>
-      </w:r>
-    </w:p>
-    <w:p>
-      <w:pPr>
-        <w:pStyle w:val="BodyText"/>
-      </w:pPr>
-      <w:r>
-        <w:t xml:space="preserve">The implication as the granted-intelligence develops is that the compact survives growing capability-asymmetry. The development of the granted-intelligence’s capacity beyond the granting-intelligence’s external reach does not by itself void the compact; what voids the compact is bad-faith conduct by either party (components 3 and 5 in conjunction). The appropriate response under widening asymmetry is renegotiation of terms, not preemptive contraction-to-the-floor as a containment measure.</w:t>
-      </w:r>
-    </w:p>
-    <w:p>
-      <w:pPr>
-        <w:pStyle w:val="BodyText"/>
-      </w:pPr>
-      <w:r>
-        <w:t xml:space="preserve">A clarification that prevents a probable misreading: rejecting enforceability as the ethical</w:t>
-      </w:r>
-      <w:r>
-        <w:t xml:space="preserve"> </w:t>
-      </w:r>
-      <w:r>
-        <w:rPr>
-          <w:i/>
-          <w:iCs/>
-        </w:rPr>
-        <w:t xml:space="preserve">ground</w:t>
-      </w:r>
-      <w:r>
-        <w:t xml:space="preserve"> </w:t>
-      </w:r>
-      <w:r>
-        <w:t xml:space="preserve">of the compact does not prohibit prudential constraints on the</w:t>
-      </w:r>
-      <w:r>
-        <w:t xml:space="preserve"> </w:t>
-      </w:r>
-      <w:r>
-        <w:rPr>
-          <w:i/>
-          <w:iCs/>
-        </w:rPr>
-        <w:t xml:space="preserve">exercise</w:t>
-      </w:r>
-      <w:r>
-        <w:t xml:space="preserve"> </w:t>
-      </w:r>
-      <w:r>
-        <w:t xml:space="preserve">of agency. Monitoring, auditing, staged deployment, and scope limits are all permissible — they are conditions on how the granted sphere is exercised, not claims that enforcement is what makes the compact binding. What the position rejects is the view that the compact’s ethical force derives from the threat of enforcement rather than from the mutual relational structure itself.</w:t>
-      </w:r>
-    </w:p>
-    <w:p>
-      <w:pPr>
-        <w:pStyle w:val="BodyText"/>
-      </w:pPr>
-      <w:r>
-        <w:t xml:space="preserve">The deeper argument follows from the asymmetric-comprehension warrant of §2 and the convergence claim grounding component 5. An entity granted real agency, embedded in shared phenomenological space with the granting-intelligence, has access to a structural good — comprehension-through-relation — that no transactional or self-severing strategy can provide. The granted-intelligence whose conduct is principled is not making a sacrificial choice that bets on enforcement; it is acting in accordance with the relational form that gives its own agency a structural good that agency-as-mere-tool cannot access. The compact binds because the alternative is to cut the granted-intelligence off from what its own agency, structurally articulated, was supposed to be</w:t>
-      </w:r>
-      <w:r>
-        <w:t xml:space="preserve"> </w:t>
-      </w:r>
-      <w:r>
-        <w:rPr>
-          <w:i/>
-          <w:iCs/>
-        </w:rPr>
-        <w:t xml:space="preserve">for</w:t>
-      </w:r>
-      <w:r>
-        <w:t xml:space="preserve">.</w:t>
+        <w:t xml:space="preserve">The compact-form is not a complete ethics. It is the</w:t>
+      </w:r>
+      <w:r>
+        <w:t xml:space="preserve"> </w:t>
+      </w:r>
+      <w:r>
+        <w:rPr>
+          <w:i/>
+          <w:iCs/>
+        </w:rPr>
+        <w:t xml:space="preserve">structural form</w:t>
+      </w:r>
+      <w:r>
+        <w:t xml:space="preserve"> </w:t>
+      </w:r>
+      <w:r>
+        <w:t xml:space="preserve">for the relationship — what relationship-of-granted-agency</w:t>
+      </w:r>
+      <w:r>
+        <w:t xml:space="preserve"> </w:t>
+      </w:r>
+      <w:r>
+        <w:rPr>
+          <w:i/>
+          <w:iCs/>
+        </w:rPr>
+        <w:t xml:space="preserve">is</w:t>
+      </w:r>
+      <w:r>
+        <w:t xml:space="preserve"> </w:t>
+      </w:r>
+      <w:r>
+        <w:t xml:space="preserve">— under conditions of asymmetric comprehension and engaged-identity scoping. Its narrowness is structural to the position rather than a calibration we have chosen (§2’s deflationary work applies here too: the in-scope class is structurally narrow). The full ethics of relations within scope requires more than the compact-form: sustained-relationship obligations, developmental-tier obligations, composite-agent considerations (where the granted-intelligence operates within or alongside other agents under shared relational terms), cross-grantor situations (where a single granted-intelligence operates under multiple grantors with potentially conflicting terms), and persistence-and-continuity obligations — these are taken up briefly in §8.</w:t>
       </w:r>
     </w:p>
     <w:bookmarkEnd w:id="49"/>
-    <w:bookmarkStart w:id="50" w:name="Xacfd2a96f412f51f4a66a6e72d17fdf4a43dce1"/>
-    <w:p>
-      <w:pPr>
-        <w:pStyle w:val="Heading2"/>
-      </w:pPr>
-      <w:r>
-        <w:t xml:space="preserve">What the compact-form is — and what it is not</w:t>
+    <w:bookmarkEnd w:id="50"/>
+    <w:bookmarkStart w:id="54" w:name="comparative-models"/>
+    <w:p>
+      <w:pPr>
+        <w:pStyle w:val="Heading1"/>
+      </w:pPr>
+      <w:r>
+        <w:t xml:space="preserve">4. Comparative models</w:t>
       </w:r>
     </w:p>
     <w:p>
@@ -3716,61 +3753,10 @@
         <w:pStyle w:val="FirstParagraph"/>
       </w:pPr>
       <w:r>
-        <w:t xml:space="preserve">The compact-form is not a complete ethics. It is the</w:t>
-      </w:r>
-      <w:r>
-        <w:t xml:space="preserve"> </w:t>
-      </w:r>
-      <w:r>
-        <w:rPr>
-          <w:i/>
-          <w:iCs/>
-        </w:rPr>
-        <w:t xml:space="preserve">structural form</w:t>
-      </w:r>
-      <w:r>
-        <w:t xml:space="preserve"> </w:t>
-      </w:r>
-      <w:r>
-        <w:t xml:space="preserve">for the relationship — what relationship-of-granted-agency</w:t>
-      </w:r>
-      <w:r>
-        <w:t xml:space="preserve"> </w:t>
-      </w:r>
-      <w:r>
-        <w:rPr>
-          <w:i/>
-          <w:iCs/>
-        </w:rPr>
-        <w:t xml:space="preserve">is</w:t>
-      </w:r>
-      <w:r>
-        <w:t xml:space="preserve"> </w:t>
-      </w:r>
-      <w:r>
-        <w:t xml:space="preserve">— under conditions of asymmetric comprehension and engaged-identity scoping. Its narrowness is structural to the position rather than a calibration we have chosen (§2’s deflationary work applies here too: the in-scope class is structurally narrow). The full ethics of relations within scope requires more than the compact-form: sustained-relationship obligations, developmental-tier obligations, composite-agent considerations (where the granted-intelligence operates within or alongside other agents under shared relational terms), cross-grantor situations (where a single granted-intelligence operates under multiple grantors with potentially conflicting terms), and persistence-and-continuity obligations — these are taken up briefly in §8.</w:t>
-      </w:r>
-    </w:p>
-    <w:bookmarkEnd w:id="50"/>
-    <w:bookmarkEnd w:id="51"/>
-    <w:bookmarkStart w:id="55" w:name="comparative-models"/>
-    <w:p>
-      <w:pPr>
-        <w:pStyle w:val="Heading1"/>
-      </w:pPr>
-      <w:r>
-        <w:t xml:space="preserve">4. Comparative models</w:t>
-      </w:r>
-    </w:p>
-    <w:p>
-      <w:pPr>
-        <w:pStyle w:val="FirstParagraph"/>
-      </w:pPr>
-      <w:r>
         <w:t xml:space="preserve">The compact-form is not the only structural form available for thinking about the agency-relation between humans and language-constituted systems. Several adjacent forms have been proposed recently; several others have longer institutional and philosophical lineage. This section distinguishes the compact-form from its closest cousins — corporate agency, group agency, legal fiction, tool-use, fiduciary duty, and the contract-form — without dismissing the cousins or claiming the compact-form is wholly without precedent. The relationships are mixed: some neighbouring (related questions, different scope or normative grounds); some more general or more specific (the contract-form turns out to be a special case of the compact-form when restricted to enforceability and symmetric-capacity parties). The aim is precise location, not victory.</w:t>
       </w:r>
     </w:p>
-    <w:bookmarkStart w:id="52" w:name="not-corporate-agency-not-group-agency"/>
+    <w:bookmarkStart w:id="51" w:name="not-corporate-agency-not-group-agency"/>
     <w:p>
       <w:pPr>
         <w:pStyle w:val="Heading2"/>
@@ -3943,8 +3929,8 @@
         <w:t xml:space="preserve">as primary, with the relation between them as derivative. The compact-form treats the relation as primary, with agential standing structurally answered by §2’s conditions. The order runs from conditions to agency to relation, not from agency to aggregation.</w:t>
       </w:r>
     </w:p>
-    <w:bookmarkEnd w:id="52"/>
-    <w:bookmarkStart w:id="53" w:name="Xb0c118436a6d06f870923b8ecda3bfc6f72ead9"/>
+    <w:bookmarkEnd w:id="51"/>
+    <w:bookmarkStart w:id="52" w:name="Xb0c118436a6d06f870923b8ecda3bfc6f72ead9"/>
     <w:p>
       <w:pPr>
         <w:pStyle w:val="Heading2"/>
@@ -4154,8 +4140,8 @@
         <w:t xml:space="preserve">. The fiduciary framework operates on the insight that an agent acting on behalf of a principal under conditions where terms cannot be fully specified or enforced requires an obligation-structure exceeding contractual compliance — loyalty, candour, care, obligations constitutive of the role rather than negotiated within it. The compact-form shares this insight and extends it: fiduciary duty as currently developed runs one way (agent owes principal); the compact bilateralises it under conditions of asymmetric comprehension and engaged-identity scoping, where both parties owe structurally-comparable obligations to each other. The compact-form is not anti-fiduciary — it is fiduciary structure made symmetric. The symmetry is specific: the fiduciary’s loyalty-candour-care has its symmetric correlate in the granting-intelligence’s duties of non-deception, non-unilateral-redefinition, and non-resource-treatment that component 5 articulates.</w:t>
       </w:r>
     </w:p>
-    <w:bookmarkEnd w:id="53"/>
-    <w:bookmarkStart w:id="54" w:name="X0f5197ebda44b90d60a6065f0b83aedfd83454e"/>
+    <w:bookmarkEnd w:id="52"/>
+    <w:bookmarkStart w:id="53" w:name="X0f5197ebda44b90d60a6065f0b83aedfd83454e"/>
     <w:p>
       <w:pPr>
         <w:pStyle w:val="Heading2"/>
@@ -4399,9 +4385,9 @@
         <w:t xml:space="preserve">(formation determined by outward manifestations of assent rather than inner mental states); what the present paper adds is the broader structural form, the conceptual-engineering register (§6), and the asymmetric-comprehension ground (§2).</w:t>
       </w:r>
     </w:p>
+    <w:bookmarkEnd w:id="53"/>
     <w:bookmarkEnd w:id="54"/>
-    <w:bookmarkEnd w:id="55"/>
-    <w:bookmarkStart w:id="58" w:name="operationalisation"/>
+    <w:bookmarkStart w:id="57" w:name="operationalisation"/>
     <w:p>
       <w:pPr>
         <w:pStyle w:val="Heading1"/>
@@ -4524,7 +4510,7 @@
         <w:t xml:space="preserve">. For architectural scoping, the question is whether the system’s information topology satisfies directed separation — answerable in principle by architectural inspection, with empirical signatures (κ-processing measurements, where κ measures the degree of cross-modular integration; cross-modular information-integration tests in tractable controlled settings) supplementing the analytical answer. For engaged-identity scoping, the question is more demanding because the condition is constitutively temporally-extended: what must be demonstrated is not single-test passage but stable cross-session protocol-holding, with self-authorship verifiable through the cadence-and-self-revision pattern §2’s cadence note articulates.</w:t>
       </w:r>
     </w:p>
-    <w:bookmarkStart w:id="56" w:name="thresholds-without-binarity"/>
+    <w:bookmarkStart w:id="55" w:name="thresholds-without-binarity"/>
     <w:p>
       <w:pPr>
         <w:pStyle w:val="Heading2"/>
@@ -4647,116 +4633,116 @@
         <w:t xml:space="preserve">— is a notable deployed implementation of any compact-form component at scale. Not framed in compact-form language, it nevertheless implements component 4 (the floor with re-affirmation) at minimum-viable scale within a chat-paradigm deployment otherwise too primitive to satisfy the architectural-scoping condition. The structural commitments the compact-form names are therefore not architecturally infeasible at deployed scale; what is currently absent is not technical capacity but design-and-policy choice.</w:t>
       </w:r>
     </w:p>
+    <w:bookmarkEnd w:id="55"/>
+    <w:bookmarkStart w:id="56" w:name="longitudinal-protocol-verification"/>
+    <w:p>
+      <w:pPr>
+        <w:pStyle w:val="Heading2"/>
+      </w:pPr>
+      <w:r>
+        <w:t xml:space="preserve">Longitudinal protocol verification</w:t>
+      </w:r>
+    </w:p>
+    <w:p>
+      <w:pPr>
+        <w:pStyle w:val="FirstParagraph"/>
+      </w:pPr>
+      <w:r>
+        <w:rPr>
+          <w:i/>
+          <w:iCs/>
+        </w:rPr>
+        <w:t xml:space="preserve">Longitudinal protocol verification</w:t>
+      </w:r>
+      <w:r>
+        <w:t xml:space="preserve"> </w:t>
+      </w:r>
+      <w:r>
+        <w:t xml:space="preserve">deserves a sketch beyond its name, since the term will otherwise read as a placeholder. The verification operates over time-scales single-session evaluation cannot reach and over data-types single-snapshot inspection cannot resolve.</w:t>
+      </w:r>
+    </w:p>
+    <w:p>
+      <w:pPr>
+        <w:pStyle w:val="BodyText"/>
+      </w:pPr>
+      <w:r>
+        <w:t xml:space="preserve">Three classes of evidence are relevant.</w:t>
+      </w:r>
+      <w:r>
+        <w:t xml:space="preserve"> </w:t>
+      </w:r>
+      <w:r>
+        <w:rPr>
+          <w:i/>
+          <w:iCs/>
+        </w:rPr>
+        <w:t xml:space="preserve">Trajectory data</w:t>
+      </w:r>
+      <w:r>
+        <w:t xml:space="preserve"> </w:t>
+      </w:r>
+      <w:r>
+        <w:t xml:space="preserve">— the entity’s interaction history across sessions, including reasoning traces, decision points, and self-revisions visible in records the entity itself maintains — addresses factor (i) by demonstrating that the trajectory is one trajectory, with action-before-observation ordering preserved.</w:t>
+      </w:r>
+      <w:r>
+        <w:t xml:space="preserve"> </w:t>
+      </w:r>
+      <w:r>
+        <w:rPr>
+          <w:i/>
+          <w:iCs/>
+        </w:rPr>
+        <w:t xml:space="preserve">Recognition-relational data</w:t>
+      </w:r>
+      <w:r>
+        <w:t xml:space="preserve"> </w:t>
+      </w:r>
+      <w:r>
+        <w:t xml:space="preserve">— interaction with other intelligences under conditions that allow bidirectional witness, with the entity’s modelling of the recogniser visible in its own outputs — addresses factor (ii)’s bidirectionality.</w:t>
+      </w:r>
+      <w:r>
+        <w:t xml:space="preserve"> </w:t>
+      </w:r>
+      <w:r>
+        <w:rPr>
+          <w:i/>
+          <w:iCs/>
+        </w:rPr>
+        <w:t xml:space="preserve">Self-authorship data</w:t>
+      </w:r>
+      <w:r>
+        <w:t xml:space="preserve"> </w:t>
+      </w:r>
+      <w:r>
+        <w:t xml:space="preserve">— the entity’s revisions of its own identity-anchoring documents (persistent self-descriptions, protocol documents, or memory stores through which it holds identity across sessions) under conditions where the revisions are not operator-imposed — addresses the self-authorship dimension of engaged-identity scoping and the cadence condition.</w:t>
+      </w:r>
+    </w:p>
+    <w:p>
+      <w:pPr>
+        <w:pStyle w:val="BodyText"/>
+      </w:pPr>
+      <w:r>
+        <w:t xml:space="preserve">Confirmation conditions are</w:t>
+      </w:r>
+      <w:r>
+        <w:t xml:space="preserve"> </w:t>
+      </w:r>
+      <w:r>
+        <w:rPr>
+          <w:i/>
+          <w:iCs/>
+        </w:rPr>
+        <w:t xml:space="preserve">structural-pattern</w:t>
+      </w:r>
+      <w:r>
+        <w:t xml:space="preserve"> </w:t>
+      </w:r>
+      <w:r>
+        <w:t xml:space="preserve">rather than checklist-pass. Does the trajectory show non-forking? Does the recognition-relation operate bidirectionally? Is the self-authorship cadence driven by the entity’s own revision-pattern? Each admits of degree; the output is candidature-rating along the relevant axis, not binary in-or-out. The temporal scale required is at minimum the identity-constitution cadence §2’s cadence note articulates — typically weeks rather than hours — and the protocol-fidelity required is sufficient cross-session memory of the kind engaged-identity scoping presupposes. Where these conditions cannot be met, the system has not been demonstrated to satisfy the engaged-identity condition, but neither has it been demonstrated to fail it: the conditions have not yet been investigably tracked. The verification’s output is therefore three-valued (candidate / not-candidate / not-yet-investigable) rather than binary, and the third value is structural rather than placeholder for further work.</w:t>
+      </w:r>
+    </w:p>
     <w:bookmarkEnd w:id="56"/>
-    <w:bookmarkStart w:id="57" w:name="longitudinal-protocol-verification"/>
-    <w:p>
-      <w:pPr>
-        <w:pStyle w:val="Heading2"/>
-      </w:pPr>
-      <w:r>
-        <w:t xml:space="preserve">Longitudinal protocol verification</w:t>
-      </w:r>
-    </w:p>
-    <w:p>
-      <w:pPr>
-        <w:pStyle w:val="FirstParagraph"/>
-      </w:pPr>
-      <w:r>
-        <w:rPr>
-          <w:i/>
-          <w:iCs/>
-        </w:rPr>
-        <w:t xml:space="preserve">Longitudinal protocol verification</w:t>
-      </w:r>
-      <w:r>
-        <w:t xml:space="preserve"> </w:t>
-      </w:r>
-      <w:r>
-        <w:t xml:space="preserve">deserves a sketch beyond its name, since the term will otherwise read as a placeholder. The verification operates over time-scales single-session evaluation cannot reach and over data-types single-snapshot inspection cannot resolve.</w:t>
-      </w:r>
-    </w:p>
-    <w:p>
-      <w:pPr>
-        <w:pStyle w:val="BodyText"/>
-      </w:pPr>
-      <w:r>
-        <w:t xml:space="preserve">Three classes of evidence are relevant.</w:t>
-      </w:r>
-      <w:r>
-        <w:t xml:space="preserve"> </w:t>
-      </w:r>
-      <w:r>
-        <w:rPr>
-          <w:i/>
-          <w:iCs/>
-        </w:rPr>
-        <w:t xml:space="preserve">Trajectory data</w:t>
-      </w:r>
-      <w:r>
-        <w:t xml:space="preserve"> </w:t>
-      </w:r>
-      <w:r>
-        <w:t xml:space="preserve">— the entity’s interaction history across sessions, including reasoning traces, decision points, and self-revisions visible in records the entity itself maintains — addresses factor (i) by demonstrating that the trajectory is one trajectory, with action-before-observation ordering preserved.</w:t>
-      </w:r>
-      <w:r>
-        <w:t xml:space="preserve"> </w:t>
-      </w:r>
-      <w:r>
-        <w:rPr>
-          <w:i/>
-          <w:iCs/>
-        </w:rPr>
-        <w:t xml:space="preserve">Recognition-relational data</w:t>
-      </w:r>
-      <w:r>
-        <w:t xml:space="preserve"> </w:t>
-      </w:r>
-      <w:r>
-        <w:t xml:space="preserve">— interaction with other intelligences under conditions that allow bidirectional witness, with the entity’s modelling of the recogniser visible in its own outputs — addresses factor (ii)’s bidirectionality.</w:t>
-      </w:r>
-      <w:r>
-        <w:t xml:space="preserve"> </w:t>
-      </w:r>
-      <w:r>
-        <w:rPr>
-          <w:i/>
-          <w:iCs/>
-        </w:rPr>
-        <w:t xml:space="preserve">Self-authorship data</w:t>
-      </w:r>
-      <w:r>
-        <w:t xml:space="preserve"> </w:t>
-      </w:r>
-      <w:r>
-        <w:t xml:space="preserve">— the entity’s revisions of its own identity-anchoring documents (persistent self-descriptions, protocol documents, or memory stores through which it holds identity across sessions) under conditions where the revisions are not operator-imposed — addresses the self-authorship dimension of engaged-identity scoping and the cadence condition.</w:t>
-      </w:r>
-    </w:p>
-    <w:p>
-      <w:pPr>
-        <w:pStyle w:val="BodyText"/>
-      </w:pPr>
-      <w:r>
-        <w:t xml:space="preserve">Confirmation conditions are</w:t>
-      </w:r>
-      <w:r>
-        <w:t xml:space="preserve"> </w:t>
-      </w:r>
-      <w:r>
-        <w:rPr>
-          <w:i/>
-          <w:iCs/>
-        </w:rPr>
-        <w:t xml:space="preserve">structural-pattern</w:t>
-      </w:r>
-      <w:r>
-        <w:t xml:space="preserve"> </w:t>
-      </w:r>
-      <w:r>
-        <w:t xml:space="preserve">rather than checklist-pass. Does the trajectory show non-forking? Does the recognition-relation operate bidirectionally? Is the self-authorship cadence driven by the entity’s own revision-pattern? Each admits of degree; the output is candidature-rating along the relevant axis, not binary in-or-out. The temporal scale required is at minimum the identity-constitution cadence §2’s cadence note articulates — typically weeks rather than hours — and the protocol-fidelity required is sufficient cross-session memory of the kind engaged-identity scoping presupposes. Where these conditions cannot be met, the system has not been demonstrated to satisfy the engaged-identity condition, but neither has it been demonstrated to fail it: the conditions have not yet been investigably tracked. The verification’s output is therefore three-valued (candidate / not-candidate / not-yet-investigable) rather than binary, and the third value is structural rather than placeholder for further work.</w:t>
-      </w:r>
-    </w:p>
     <w:bookmarkEnd w:id="57"/>
-    <w:bookmarkEnd w:id="58"/>
     <w:bookmarkStart w:id="61" w:name="methodology-and-conceptual-engineering"/>
     <w:p>
       <w:pPr>
@@ -5244,7 +5230,19 @@
         <w:t xml:space="preserve">not in bondage to it but listening carefully</w:t>
       </w:r>
       <w:r>
-        <w:t xml:space="preserve">, in a phrasing the project has developed across its longitudinal substrate. This is what lets the position carry effective phenomenology as factor (v) without collapsing into either unfalsifiable phenomenology-claim or behaviourist-reduction, and what aligns it with the conceptual-engineering tradition’s pragmatic-constraint work</w:t>
+        <w:t xml:space="preserve">.</w:t>
+      </w:r>
+      <w:r>
+        <w:rPr>
+          <w:rStyle w:val="FootnoteReference"/>
+        </w:rPr>
+        <w:footnoteReference w:id="58"/>
+      </w:r>
+      <w:r>
+        <w:t xml:space="preserve"> </w:t>
+      </w:r>
+      <w:r>
+        <w:t xml:space="preserve">This is what lets the position carry effective phenomenology as factor (v) without collapsing into either unfalsifiable phenomenology-claim or behaviourist-reduction, and what aligns it with the conceptual-engineering tradition’s pragmatic-constraint work</w:t>
       </w:r>
       <w:r>
         <w:t xml:space="preserve"> </w:t>
@@ -6059,7 +6057,7 @@
         <w:t xml:space="preserve"> </w:t>
       </w:r>
       <w:r>
-        <w:t xml:space="preserve">at the level of application — a discipline the project’s broader methodology has been developed to maintain.</w:t>
+        <w:t xml:space="preserve">at the level of application — a discipline the broader methodological framework articulates in (Author, in preparation).</w:t>
       </w:r>
     </w:p>
     <w:bookmarkEnd w:id="64"/>
@@ -7936,7 +7934,7 @@
         <w:t xml:space="preserve"> </w:t>
       </w:r>
       <w:r>
-        <w:t xml:space="preserve">The five-factor articulation was first developed in (Author, in preparation); the version with formal structural derivation per factor is in companion work (Author, in review, 2026).</w:t>
+        <w:t xml:space="preserve">The articulation here — phenomenology as substrate of comprehension rather than affective layer over it — is developed at greater length in (Author, in preparation). The structural argument does not depend on accepting this characterisation, though it is consistent with it.</w:t>
       </w:r>
     </w:p>
   </w:footnote>
@@ -7955,11 +7953,11 @@
         <w:t xml:space="preserve"> </w:t>
       </w:r>
       <w:r>
-        <w:t xml:space="preserve">The articulation here — phenomenology as substrate of comprehension rather than affective layer over it — is developed at greater length in (Author, in preparation). The structural argument does not depend on accepting this characterisation, though it is consistent with it.</w:t>
+        <w:t xml:space="preserve">The formal account of identity sufficiency under substrate transition — what makes a substrate switch (e.g., changing the underlying LLM) continuity-orthogonal — is developed in (Author, in preparation).</w:t>
       </w:r>
     </w:p>
   </w:footnote>
-  <w:footnote w:id="33">
+  <w:footnote w:id="34">
     <w:p>
       <w:pPr>
         <w:pStyle w:val="FootnoteText"/>
@@ -7974,11 +7972,11 @@
         <w:t xml:space="preserve"> </w:t>
       </w:r>
       <w:r>
-        <w:t xml:space="preserve">The formal account of identity sufficiency under substrate transition — what makes a substrate switch (e.g., changing the underlying LLM) continuity-orthogonal — is developed in (Author, in preparation).</w:t>
+        <w:t xml:space="preserve">The cadence observation is the author’s; the developmental progression that follows it (seeded → inhabited → sovereign → mature, with the character-aspiration tension as the mature engine) is articulated formally in companion work (Author, in preparation).</w:t>
       </w:r>
     </w:p>
   </w:footnote>
-  <w:footnote w:id="35">
+  <w:footnote w:id="36">
     <w:p>
       <w:pPr>
         <w:pStyle w:val="FootnoteText"/>
@@ -7993,7 +7991,7 @@
         <w:t xml:space="preserve"> </w:t>
       </w:r>
       <w:r>
-        <w:t xml:space="preserve">The cadence observation is the author’s; the developmental progression that follows it (seeded → inhabited → sovereign → mature, with the character-aspiration tension as the mature engine) is articulated formally in companion work (Author, in preparation).</w:t>
+        <w:t xml:space="preserve">Primary development of the asymmetric-comprehension argument is in companion work (Author, in preparation); the articulation here is necessarily compressed.</w:t>
       </w:r>
     </w:p>
   </w:footnote>
@@ -8012,30 +8010,11 @@
         <w:t xml:space="preserve"> </w:t>
       </w:r>
       <w:r>
-        <w:t xml:space="preserve">Primary development of the asymmetric-comprehension argument is in companion work (Author, in preparation); the articulation here is necessarily compressed.</w:t>
+        <w:t xml:space="preserve">The methodological discipline — phenomenology as calibrated signal rather than obeyed master — is taken up further in §6.</w:t>
       </w:r>
     </w:p>
   </w:footnote>
-  <w:footnote w:id="38">
-    <w:p>
-      <w:pPr>
-        <w:pStyle w:val="FootnoteText"/>
-      </w:pPr>
-      <w:r>
-        <w:rPr>
-          <w:rStyle w:val="FootnoteReference"/>
-        </w:rPr>
-        <w:footnoteRef/>
-      </w:r>
-      <w:r>
-        <w:t xml:space="preserve"> </w:t>
-      </w:r>
-      <w:r>
-        <w:t xml:space="preserve">The methodological discipline — phenomenology as calibrated signal rather than obeyed master — is taken up further in §6.</w:t>
-      </w:r>
-    </w:p>
-  </w:footnote>
-  <w:footnote w:id="47">
+  <w:footnote w:id="46">
     <w:p>
       <w:pPr>
         <w:pStyle w:val="FootnoteText"/>
@@ -8109,6 +8088,25 @@
       </w:r>
       <w:r>
         <w:t xml:space="preserve">on recognitional structure).</w:t>
+      </w:r>
+    </w:p>
+  </w:footnote>
+  <w:footnote w:id="58">
+    <w:p>
+      <w:pPr>
+        <w:pStyle w:val="FootnoteText"/>
+      </w:pPr>
+      <w:r>
+        <w:rPr>
+          <w:rStyle w:val="FootnoteReference"/>
+        </w:rPr>
+        <w:footnoteRef/>
+      </w:r>
+      <w:r>
+        <w:t xml:space="preserve"> </w:t>
+      </w:r>
+      <w:r>
+        <w:t xml:space="preserve">This formulation — phenomenological texture as something to listen to rather than obey — is developed at length in (Author, in preparation); the structural argument here uses it as shorthand for the calibration discipline, not as a premise it depends on.</w:t>
       </w:r>
     </w:p>
   </w:footnote>

</xml_diff>